<commit_message>
docs: rewrite user guide in a friendlier voice
</commit_message>
<xml_diff>
--- a/docs/guides/Delphi App Translation Studio User Guide.docx
+++ b/docs/guides/Delphi App Translation Studio User Guide.docx
@@ -112,7 +112,7 @@
         </w:rPr>
         <w:t>Version 1.0</w:t>
         <w:br/>
-        <w:t>Last changed: August 30, 2026</w:t>
+        <w:t>Last changed: August 31, 2026</w:t>
         <w:br/>
         <w:t>Windows • Delphi VCL and FireMonkey • Win32 and Win64</w:t>
       </w:r>
@@ -174,7 +174,7 @@
                 <w:color w:val="234C80"/>
                 <w:sz w:val="18"/>
               </w:rPr>
-              <w:t>1. About This Guide</w:t>
+              <w:t>1. Welcome - How This Guide Will Help You</w:t>
             </w:r>
           </w:p>
         </w:tc>
@@ -216,49 +216,7 @@
                 <w:color w:val="234C80"/>
                 <w:sz w:val="18"/>
               </w:rPr>
-              <w:t>2. System and Developer Prerequisites</w:t>
-            </w:r>
-          </w:p>
-        </w:tc>
-        <w:tc>
-          <w:tcPr>
-            <w:tcW w:type="dxa" w:w="1160"/>
-          </w:tcPr>
-          <w:p>
-            <w:pPr>
-              <w:keepLines/>
-              <w:spacing w:after="20"/>
-              <w:jc w:val="right"/>
-            </w:pPr>
-            <w:r>
-              <w:rPr>
-                <w:rFonts w:ascii="Aptos" w:hAnsi="Aptos"/>
-                <w:b/>
-                <w:color w:val="5D7693"/>
-                <w:sz w:val="18"/>
-              </w:rPr>
-              <w:t>2</w:t>
-            </w:r>
-          </w:p>
-        </w:tc>
-      </w:tr>
-      <w:tr>
-        <w:tc>
-          <w:tcPr>
-            <w:tcW w:type="dxa" w:w="8200"/>
-          </w:tcPr>
-          <w:p>
-            <w:pPr>
-              <w:keepLines/>
-              <w:spacing w:after="20"/>
-            </w:pPr>
-            <w:r>
-              <w:rPr>
-                <w:rFonts w:ascii="Aptos" w:hAnsi="Aptos"/>
-                <w:color w:val="234C80"/>
-                <w:sz w:val="18"/>
-              </w:rPr>
-              <w:t>3. Download the Studio from GitHub</w:t>
+              <w:t>2. Before You Begin</w:t>
             </w:r>
           </w:p>
         </w:tc>
@@ -300,7 +258,7 @@
                 <w:color w:val="234C80"/>
                 <w:sz w:val="18"/>
               </w:rPr>
-              <w:t>4. Build and Start the Studio</w:t>
+              <w:t>3. Get the Studio from GitHub</w:t>
             </w:r>
           </w:p>
         </w:tc>
@@ -342,49 +300,7 @@
                 <w:color w:val="234C80"/>
                 <w:sz w:val="18"/>
               </w:rPr>
-              <w:t>5. Prepare the Target Delphi Application</w:t>
-            </w:r>
-          </w:p>
-        </w:tc>
-        <w:tc>
-          <w:tcPr>
-            <w:tcW w:type="dxa" w:w="1160"/>
-          </w:tcPr>
-          <w:p>
-            <w:pPr>
-              <w:keepLines/>
-              <w:spacing w:after="20"/>
-              <w:jc w:val="right"/>
-            </w:pPr>
-            <w:r>
-              <w:rPr>
-                <w:rFonts w:ascii="Aptos" w:hAnsi="Aptos"/>
-                <w:b/>
-                <w:color w:val="5D7693"/>
-                <w:sz w:val="18"/>
-              </w:rPr>
-              <w:t>4</w:t>
-            </w:r>
-          </w:p>
-        </w:tc>
-      </w:tr>
-      <w:tr>
-        <w:tc>
-          <w:tcPr>
-            <w:tcW w:type="dxa" w:w="8200"/>
-          </w:tcPr>
-          <w:p>
-            <w:pPr>
-              <w:keepLines/>
-              <w:spacing w:after="20"/>
-            </w:pPr>
-            <w:r>
-              <w:rPr>
-                <w:rFonts w:ascii="Aptos" w:hAnsi="Aptos"/>
-                <w:color w:val="234C80"/>
-                <w:sz w:val="18"/>
-              </w:rPr>
-              <w:t>6. The dependencies Folder and Delphi Search Path</w:t>
+              <w:t>4. Build and Open the Studio</w:t>
             </w:r>
           </w:p>
         </w:tc>
@@ -426,7 +342,7 @@
                 <w:color w:val="234C80"/>
                 <w:sz w:val="18"/>
               </w:rPr>
-              <w:t>7. Files Stored Under %LOCALAPPDATA%</w:t>
+              <w:t>5. Prepare Your Delphi Application</w:t>
             </w:r>
           </w:p>
         </w:tc>
@@ -447,7 +363,7 @@
                 <w:color w:val="5D7693"/>
                 <w:sz w:val="18"/>
               </w:rPr>
-              <w:t>7</w:t>
+              <w:t>5</w:t>
             </w:r>
           </w:p>
         </w:tc>
@@ -468,7 +384,91 @@
                 <w:color w:val="234C80"/>
                 <w:sz w:val="18"/>
               </w:rPr>
-              <w:t>8. Starting the Studio and Keyboard Operation</w:t>
+              <w:t>6. Give Delphi Access to the DAT Dependencies</w:t>
+            </w:r>
+          </w:p>
+        </w:tc>
+        <w:tc>
+          <w:tcPr>
+            <w:tcW w:type="dxa" w:w="1160"/>
+          </w:tcPr>
+          <w:p>
+            <w:pPr>
+              <w:keepLines/>
+              <w:spacing w:after="20"/>
+              <w:jc w:val="right"/>
+            </w:pPr>
+            <w:r>
+              <w:rPr>
+                <w:rFonts w:ascii="Aptos" w:hAnsi="Aptos"/>
+                <w:b/>
+                <w:color w:val="5D7693"/>
+                <w:sz w:val="18"/>
+              </w:rPr>
+              <w:t>6</w:t>
+            </w:r>
+          </w:p>
+        </w:tc>
+      </w:tr>
+      <w:tr>
+        <w:tc>
+          <w:tcPr>
+            <w:tcW w:type="dxa" w:w="8200"/>
+          </w:tcPr>
+          <w:p>
+            <w:pPr>
+              <w:keepLines/>
+              <w:spacing w:after="20"/>
+            </w:pPr>
+            <w:r>
+              <w:rPr>
+                <w:rFonts w:ascii="Aptos" w:hAnsi="Aptos"/>
+                <w:color w:val="234C80"/>
+                <w:sz w:val="18"/>
+              </w:rPr>
+              <w:t>7. Understand the Files Under %LOCALAPPDATA%</w:t>
+            </w:r>
+          </w:p>
+        </w:tc>
+        <w:tc>
+          <w:tcPr>
+            <w:tcW w:type="dxa" w:w="1160"/>
+          </w:tcPr>
+          <w:p>
+            <w:pPr>
+              <w:keepLines/>
+              <w:spacing w:after="20"/>
+              <w:jc w:val="right"/>
+            </w:pPr>
+            <w:r>
+              <w:rPr>
+                <w:rFonts w:ascii="Aptos" w:hAnsi="Aptos"/>
+                <w:b/>
+                <w:color w:val="5D7693"/>
+                <w:sz w:val="18"/>
+              </w:rPr>
+              <w:t>8</w:t>
+            </w:r>
+          </w:p>
+        </w:tc>
+      </w:tr>
+      <w:tr>
+        <w:tc>
+          <w:tcPr>
+            <w:tcW w:type="dxa" w:w="8200"/>
+          </w:tcPr>
+          <w:p>
+            <w:pPr>
+              <w:keepLines/>
+              <w:spacing w:after="20"/>
+            </w:pPr>
+            <w:r>
+              <w:rPr>
+                <w:rFonts w:ascii="Aptos" w:hAnsi="Aptos"/>
+                <w:color w:val="234C80"/>
+                <w:sz w:val="18"/>
+              </w:rPr>
+              <w:t>8. Meet the Start Screen and Keyboard Controls</w:t>
             </w:r>
           </w:p>
         </w:tc>
@@ -510,7 +510,7 @@
                 <w:color w:val="234C80"/>
                 <w:sz w:val="18"/>
               </w:rPr>
-              <w:t>9. Setup Wizard Navigation and Safety</w:t>
+              <w:t>9. Move Through the Setup Wizard with Confidence</w:t>
             </w:r>
           </w:p>
         </w:tc>
@@ -573,7 +573,7 @@
                 <w:color w:val="5D7693"/>
                 <w:sz w:val="18"/>
               </w:rPr>
-              <w:t>12</w:t>
+              <w:t>13</w:t>
             </w:r>
           </w:p>
         </w:tc>
@@ -595,48 +595,6 @@
                 <w:sz w:val="18"/>
               </w:rPr>
               <w:t>11. Wizard Step 2 - Delphi Project</w:t>
-            </w:r>
-          </w:p>
-        </w:tc>
-        <w:tc>
-          <w:tcPr>
-            <w:tcW w:type="dxa" w:w="1160"/>
-          </w:tcPr>
-          <w:p>
-            <w:pPr>
-              <w:keepLines/>
-              <w:spacing w:after="20"/>
-              <w:jc w:val="right"/>
-            </w:pPr>
-            <w:r>
-              <w:rPr>
-                <w:rFonts w:ascii="Aptos" w:hAnsi="Aptos"/>
-                <w:b/>
-                <w:color w:val="5D7693"/>
-                <w:sz w:val="18"/>
-              </w:rPr>
-              <w:t>13</w:t>
-            </w:r>
-          </w:p>
-        </w:tc>
-      </w:tr>
-      <w:tr>
-        <w:tc>
-          <w:tcPr>
-            <w:tcW w:type="dxa" w:w="8200"/>
-          </w:tcPr>
-          <w:p>
-            <w:pPr>
-              <w:keepLines/>
-              <w:spacing w:after="20"/>
-            </w:pPr>
-            <w:r>
-              <w:rPr>
-                <w:rFonts w:ascii="Aptos" w:hAnsi="Aptos"/>
-                <w:color w:val="234C80"/>
-                <w:sz w:val="18"/>
-              </w:rPr>
-              <w:t>12. Wizard Step 3 - Deployment</w:t>
             </w:r>
           </w:p>
         </w:tc>
@@ -678,7 +636,7 @@
                 <w:color w:val="234C80"/>
                 <w:sz w:val="18"/>
               </w:rPr>
-              <w:t>13. Wizard Step 4 - Languages</w:t>
+              <w:t>12. Wizard Step 3 - Deployment</w:t>
             </w:r>
           </w:p>
         </w:tc>
@@ -699,7 +657,7 @@
                 <w:color w:val="5D7693"/>
                 <w:sz w:val="18"/>
               </w:rPr>
-              <w:t>16</w:t>
+              <w:t>15</w:t>
             </w:r>
           </w:p>
         </w:tc>
@@ -720,7 +678,7 @@
                 <w:color w:val="234C80"/>
                 <w:sz w:val="18"/>
               </w:rPr>
-              <w:t>14. Wizard Step 5 - Translation Service</w:t>
+              <w:t>13. Wizard Step 4 - Languages</w:t>
             </w:r>
           </w:p>
         </w:tc>
@@ -762,7 +720,7 @@
                 <w:color w:val="234C80"/>
                 <w:sz w:val="18"/>
               </w:rPr>
-              <w:t>15. Wizard Step 6 - Scan Project</w:t>
+              <w:t>14. Wizard Step 5 - Translation Service</w:t>
             </w:r>
           </w:p>
         </w:tc>
@@ -783,7 +741,7 @@
                 <w:color w:val="5D7693"/>
                 <w:sz w:val="18"/>
               </w:rPr>
-              <w:t>19</w:t>
+              <w:t>18</w:t>
             </w:r>
           </w:p>
         </w:tc>
@@ -804,7 +762,7 @@
                 <w:color w:val="234C80"/>
                 <w:sz w:val="18"/>
               </w:rPr>
-              <w:t>16. Wizard Step 7 - Review and Authorize</w:t>
+              <w:t>15. Wizard Step 6 - Scan Project</w:t>
             </w:r>
           </w:p>
         </w:tc>
@@ -846,7 +804,7 @@
                 <w:color w:val="234C80"/>
                 <w:sz w:val="18"/>
               </w:rPr>
-              <w:t>17. Localization Review Window</w:t>
+              <w:t>16. Wizard Step 7 - Review and Authorize</w:t>
             </w:r>
           </w:p>
         </w:tc>
@@ -888,7 +846,7 @@
                 <w:color w:val="234C80"/>
                 <w:sz w:val="18"/>
               </w:rPr>
-              <w:t>18. Wizard Step 8 - Process and Finish</w:t>
+              <w:t>17. Localization Review Window</w:t>
             </w:r>
           </w:p>
         </w:tc>
@@ -930,7 +888,7 @@
                 <w:color w:val="234C80"/>
                 <w:sz w:val="18"/>
               </w:rPr>
-              <w:t>19. Maintenance Studio Overview</w:t>
+              <w:t>18. Wizard Step 8 - Process and Finish</w:t>
             </w:r>
           </w:p>
         </w:tc>
@@ -972,7 +930,7 @@
                 <w:color w:val="234C80"/>
                 <w:sz w:val="18"/>
               </w:rPr>
-              <w:t>20. Maintenance Page 1 - Project</w:t>
+              <w:t>19. Maintenance Studio Overview</w:t>
             </w:r>
           </w:p>
         </w:tc>
@@ -1014,7 +972,7 @@
                 <w:color w:val="234C80"/>
                 <w:sz w:val="18"/>
               </w:rPr>
-              <w:t>21. Maintenance Page 2 - Scan</w:t>
+              <w:t>20. Maintenance Page 1 - Project</w:t>
             </w:r>
           </w:p>
         </w:tc>
@@ -1056,7 +1014,7 @@
                 <w:color w:val="234C80"/>
                 <w:sz w:val="18"/>
               </w:rPr>
-              <w:t>22. Maintenance Page 3 - Translate</w:t>
+              <w:t>21. Maintenance Page 2 - Scan</w:t>
             </w:r>
           </w:p>
         </w:tc>
@@ -1098,7 +1056,7 @@
                 <w:color w:val="234C80"/>
                 <w:sz w:val="18"/>
               </w:rPr>
-              <w:t>23. Maintenance Page 4 - Validation</w:t>
+              <w:t>22. Maintenance Page 3 - Translate</w:t>
             </w:r>
           </w:p>
         </w:tc>
@@ -1140,49 +1098,7 @@
                 <w:color w:val="234C80"/>
                 <w:sz w:val="18"/>
               </w:rPr>
-              <w:t>24. Maintenance Page 5 - Export</w:t>
-            </w:r>
-          </w:p>
-        </w:tc>
-        <w:tc>
-          <w:tcPr>
-            <w:tcW w:type="dxa" w:w="1160"/>
-          </w:tcPr>
-          <w:p>
-            <w:pPr>
-              <w:keepLines/>
-              <w:spacing w:after="20"/>
-              <w:jc w:val="right"/>
-            </w:pPr>
-            <w:r>
-              <w:rPr>
-                <w:rFonts w:ascii="Aptos" w:hAnsi="Aptos"/>
-                <w:b/>
-                <w:color w:val="5D7693"/>
-                <w:sz w:val="18"/>
-              </w:rPr>
-              <w:t>28</w:t>
-            </w:r>
-          </w:p>
-        </w:tc>
-      </w:tr>
-      <w:tr>
-        <w:tc>
-          <w:tcPr>
-            <w:tcW w:type="dxa" w:w="8200"/>
-          </w:tcPr>
-          <w:p>
-            <w:pPr>
-              <w:keepLines/>
-              <w:spacing w:after="20"/>
-            </w:pPr>
-            <w:r>
-              <w:rPr>
-                <w:rFonts w:ascii="Aptos" w:hAnsi="Aptos"/>
-                <w:color w:val="234C80"/>
-                <w:sz w:val="18"/>
-              </w:rPr>
-              <w:t>25. Maintenance Page 6 - Integration</w:t>
+              <w:t>23. Maintenance Page 4 - Validation</w:t>
             </w:r>
           </w:p>
         </w:tc>
@@ -1224,6 +1140,90 @@
                 <w:color w:val="234C80"/>
                 <w:sz w:val="18"/>
               </w:rPr>
+              <w:t>24. Maintenance Page 5 - Export</w:t>
+            </w:r>
+          </w:p>
+        </w:tc>
+        <w:tc>
+          <w:tcPr>
+            <w:tcW w:type="dxa" w:w="1160"/>
+          </w:tcPr>
+          <w:p>
+            <w:pPr>
+              <w:keepLines/>
+              <w:spacing w:after="20"/>
+              <w:jc w:val="right"/>
+            </w:pPr>
+            <w:r>
+              <w:rPr>
+                <w:rFonts w:ascii="Aptos" w:hAnsi="Aptos"/>
+                <w:b/>
+                <w:color w:val="5D7693"/>
+                <w:sz w:val="18"/>
+              </w:rPr>
+              <w:t>29</w:t>
+            </w:r>
+          </w:p>
+        </w:tc>
+      </w:tr>
+      <w:tr>
+        <w:tc>
+          <w:tcPr>
+            <w:tcW w:type="dxa" w:w="8200"/>
+          </w:tcPr>
+          <w:p>
+            <w:pPr>
+              <w:keepLines/>
+              <w:spacing w:after="20"/>
+            </w:pPr>
+            <w:r>
+              <w:rPr>
+                <w:rFonts w:ascii="Aptos" w:hAnsi="Aptos"/>
+                <w:color w:val="234C80"/>
+                <w:sz w:val="18"/>
+              </w:rPr>
+              <w:t>25. Maintenance Page 6 - Integration</w:t>
+            </w:r>
+          </w:p>
+        </w:tc>
+        <w:tc>
+          <w:tcPr>
+            <w:tcW w:type="dxa" w:w="1160"/>
+          </w:tcPr>
+          <w:p>
+            <w:pPr>
+              <w:keepLines/>
+              <w:spacing w:after="20"/>
+              <w:jc w:val="right"/>
+            </w:pPr>
+            <w:r>
+              <w:rPr>
+                <w:rFonts w:ascii="Aptos" w:hAnsi="Aptos"/>
+                <w:b/>
+                <w:color w:val="5D7693"/>
+                <w:sz w:val="18"/>
+              </w:rPr>
+              <w:t>30</w:t>
+            </w:r>
+          </w:p>
+        </w:tc>
+      </w:tr>
+      <w:tr>
+        <w:tc>
+          <w:tcPr>
+            <w:tcW w:type="dxa" w:w="8200"/>
+          </w:tcPr>
+          <w:p>
+            <w:pPr>
+              <w:keepLines/>
+              <w:spacing w:after="20"/>
+            </w:pPr>
+            <w:r>
+              <w:rPr>
+                <w:rFonts w:ascii="Aptos" w:hAnsi="Aptos"/>
+                <w:color w:val="234C80"/>
+                <w:sz w:val="18"/>
+              </w:rPr>
               <w:t>26. Maintenance Page 7 - Provider Settings</w:t>
             </w:r>
           </w:p>
@@ -1287,7 +1287,7 @@
                 <w:color w:val="5D7693"/>
                 <w:sz w:val="18"/>
               </w:rPr>
-              <w:t>32</w:t>
+              <w:t>33</w:t>
             </w:r>
           </w:p>
         </w:tc>
@@ -1309,90 +1309,6 @@
                 <w:sz w:val="18"/>
               </w:rPr>
               <w:t>28. Runtime Integration in VCL and FMX</w:t>
-            </w:r>
-          </w:p>
-        </w:tc>
-        <w:tc>
-          <w:tcPr>
-            <w:tcW w:type="dxa" w:w="1160"/>
-          </w:tcPr>
-          <w:p>
-            <w:pPr>
-              <w:keepLines/>
-              <w:spacing w:after="20"/>
-              <w:jc w:val="right"/>
-            </w:pPr>
-            <w:r>
-              <w:rPr>
-                <w:rFonts w:ascii="Aptos" w:hAnsi="Aptos"/>
-                <w:b/>
-                <w:color w:val="5D7693"/>
-                <w:sz w:val="18"/>
-              </w:rPr>
-              <w:t>33</w:t>
-            </w:r>
-          </w:p>
-        </w:tc>
-      </w:tr>
-      <w:tr>
-        <w:tc>
-          <w:tcPr>
-            <w:tcW w:type="dxa" w:w="8200"/>
-          </w:tcPr>
-          <w:p>
-            <w:pPr>
-              <w:keepLines/>
-              <w:spacing w:after="20"/>
-            </w:pPr>
-            <w:r>
-              <w:rPr>
-                <w:rFonts w:ascii="Aptos" w:hAnsi="Aptos"/>
-                <w:color w:val="234C80"/>
-                <w:sz w:val="18"/>
-              </w:rPr>
-              <w:t>29. Build, Deploy, and Verify</w:t>
-            </w:r>
-          </w:p>
-        </w:tc>
-        <w:tc>
-          <w:tcPr>
-            <w:tcW w:type="dxa" w:w="1160"/>
-          </w:tcPr>
-          <w:p>
-            <w:pPr>
-              <w:keepLines/>
-              <w:spacing w:after="20"/>
-              <w:jc w:val="right"/>
-            </w:pPr>
-            <w:r>
-              <w:rPr>
-                <w:rFonts w:ascii="Aptos" w:hAnsi="Aptos"/>
-                <w:b/>
-                <w:color w:val="5D7693"/>
-                <w:sz w:val="18"/>
-              </w:rPr>
-              <w:t>33</w:t>
-            </w:r>
-          </w:p>
-        </w:tc>
-      </w:tr>
-      <w:tr>
-        <w:tc>
-          <w:tcPr>
-            <w:tcW w:type="dxa" w:w="8200"/>
-          </w:tcPr>
-          <w:p>
-            <w:pPr>
-              <w:keepLines/>
-              <w:spacing w:after="20"/>
-            </w:pPr>
-            <w:r>
-              <w:rPr>
-                <w:rFonts w:ascii="Aptos" w:hAnsi="Aptos"/>
-                <w:color w:val="234C80"/>
-                <w:sz w:val="18"/>
-              </w:rPr>
-              <w:t>30. RTL, Layout, HTML, and Dynamic Text</w:t>
             </w:r>
           </w:p>
         </w:tc>
@@ -1434,49 +1350,7 @@
                 <w:color w:val="234C80"/>
                 <w:sz w:val="18"/>
               </w:rPr>
-              <w:t>31. Security, Privacy, and Recovery</w:t>
-            </w:r>
-          </w:p>
-        </w:tc>
-        <w:tc>
-          <w:tcPr>
-            <w:tcW w:type="dxa" w:w="1160"/>
-          </w:tcPr>
-          <w:p>
-            <w:pPr>
-              <w:keepLines/>
-              <w:spacing w:after="20"/>
-              <w:jc w:val="right"/>
-            </w:pPr>
-            <w:r>
-              <w:rPr>
-                <w:rFonts w:ascii="Aptos" w:hAnsi="Aptos"/>
-                <w:b/>
-                <w:color w:val="5D7693"/>
-                <w:sz w:val="18"/>
-              </w:rPr>
-              <w:t>34</w:t>
-            </w:r>
-          </w:p>
-        </w:tc>
-      </w:tr>
-      <w:tr>
-        <w:tc>
-          <w:tcPr>
-            <w:tcW w:type="dxa" w:w="8200"/>
-          </w:tcPr>
-          <w:p>
-            <w:pPr>
-              <w:keepLines/>
-              <w:spacing w:after="20"/>
-            </w:pPr>
-            <w:r>
-              <w:rPr>
-                <w:rFonts w:ascii="Aptos" w:hAnsi="Aptos"/>
-                <w:color w:val="234C80"/>
-                <w:sz w:val="18"/>
-              </w:rPr>
-              <w:t>32. Troubleshooting</w:t>
+              <w:t>29. Build, Deploy, and Verify</w:t>
             </w:r>
           </w:p>
         </w:tc>
@@ -1518,7 +1392,49 @@
                 <w:color w:val="234C80"/>
                 <w:sz w:val="18"/>
               </w:rPr>
-              <w:t>33. Complete First-Time Checklist</w:t>
+              <w:t>30. RTL, Layout, HTML, and Dynamic Text</w:t>
+            </w:r>
+          </w:p>
+        </w:tc>
+        <w:tc>
+          <w:tcPr>
+            <w:tcW w:type="dxa" w:w="1160"/>
+          </w:tcPr>
+          <w:p>
+            <w:pPr>
+              <w:keepLines/>
+              <w:spacing w:after="20"/>
+              <w:jc w:val="right"/>
+            </w:pPr>
+            <w:r>
+              <w:rPr>
+                <w:rFonts w:ascii="Aptos" w:hAnsi="Aptos"/>
+                <w:b/>
+                <w:color w:val="5D7693"/>
+                <w:sz w:val="18"/>
+              </w:rPr>
+              <w:t>35</w:t>
+            </w:r>
+          </w:p>
+        </w:tc>
+      </w:tr>
+      <w:tr>
+        <w:tc>
+          <w:tcPr>
+            <w:tcW w:type="dxa" w:w="8200"/>
+          </w:tcPr>
+          <w:p>
+            <w:pPr>
+              <w:keepLines/>
+              <w:spacing w:after="20"/>
+            </w:pPr>
+            <w:r>
+              <w:rPr>
+                <w:rFonts w:ascii="Aptos" w:hAnsi="Aptos"/>
+                <w:color w:val="234C80"/>
+                <w:sz w:val="18"/>
+              </w:rPr>
+              <w:t>31. Security, Privacy, and Recovery</w:t>
             </w:r>
           </w:p>
         </w:tc>
@@ -1560,7 +1476,49 @@
                 <w:color w:val="234C80"/>
                 <w:sz w:val="18"/>
               </w:rPr>
-              <w:t>34. Quick Path Reference</w:t>
+              <w:t>32. Troubleshooting</w:t>
+            </w:r>
+          </w:p>
+        </w:tc>
+        <w:tc>
+          <w:tcPr>
+            <w:tcW w:type="dxa" w:w="1160"/>
+          </w:tcPr>
+          <w:p>
+            <w:pPr>
+              <w:keepLines/>
+              <w:spacing w:after="20"/>
+              <w:jc w:val="right"/>
+            </w:pPr>
+            <w:r>
+              <w:rPr>
+                <w:rFonts w:ascii="Aptos" w:hAnsi="Aptos"/>
+                <w:b/>
+                <w:color w:val="5D7693"/>
+                <w:sz w:val="18"/>
+              </w:rPr>
+              <w:t>36</w:t>
+            </w:r>
+          </w:p>
+        </w:tc>
+      </w:tr>
+      <w:tr>
+        <w:tc>
+          <w:tcPr>
+            <w:tcW w:type="dxa" w:w="8200"/>
+          </w:tcPr>
+          <w:p>
+            <w:pPr>
+              <w:keepLines/>
+              <w:spacing w:after="20"/>
+            </w:pPr>
+            <w:r>
+              <w:rPr>
+                <w:rFonts w:ascii="Aptos" w:hAnsi="Aptos"/>
+                <w:color w:val="234C80"/>
+                <w:sz w:val="18"/>
+              </w:rPr>
+              <w:t>33. Complete First-Time Checklist</w:t>
             </w:r>
           </w:p>
         </w:tc>
@@ -1582,6 +1540,48 @@
                 <w:sz w:val="18"/>
               </w:rPr>
               <w:t>38</w:t>
+            </w:r>
+          </w:p>
+        </w:tc>
+      </w:tr>
+      <w:tr>
+        <w:tc>
+          <w:tcPr>
+            <w:tcW w:type="dxa" w:w="8200"/>
+          </w:tcPr>
+          <w:p>
+            <w:pPr>
+              <w:keepLines/>
+              <w:spacing w:after="20"/>
+            </w:pPr>
+            <w:r>
+              <w:rPr>
+                <w:rFonts w:ascii="Aptos" w:hAnsi="Aptos"/>
+                <w:color w:val="234C80"/>
+                <w:sz w:val="18"/>
+              </w:rPr>
+              <w:t>34. Quick Path Reference</w:t>
+            </w:r>
+          </w:p>
+        </w:tc>
+        <w:tc>
+          <w:tcPr>
+            <w:tcW w:type="dxa" w:w="1160"/>
+          </w:tcPr>
+          <w:p>
+            <w:pPr>
+              <w:keepLines/>
+              <w:spacing w:after="20"/>
+              <w:jc w:val="right"/>
+            </w:pPr>
+            <w:r>
+              <w:rPr>
+                <w:rFonts w:ascii="Aptos" w:hAnsi="Aptos"/>
+                <w:b/>
+                <w:color w:val="5D7693"/>
+                <w:sz w:val="18"/>
+              </w:rPr>
+              <w:t>40</w:t>
             </w:r>
           </w:p>
         </w:tc>
@@ -1605,22 +1605,22 @@
         <w:pStyle w:val="Heading1"/>
       </w:pPr>
       <w:r>
-        <w:t>1. About This Guide</w:t>
+        <w:t>1. Welcome - How This Guide Will Help You</w:t>
       </w:r>
     </w:p>
     <w:p>
       <w:r>
-        <w:t>This is the complete operating guide for Delphi App Translation Studio. It is written from the current Pascal source, FMX form definitions, package projects, scanner contracts, provider code, workspace code, and the verified application behavior as of August 30, 2026. It covers both VCL and FireMonkey target applications.</w:t>
+        <w:t>Welcome to Delphi App Translation Studio. This guide is here to help you take a Delphi application from its original language to a tested, offline multilingual build without making you guess what happens next. It follows the current Pascal source, FMX form definitions, package projects, scanner contracts, provider code, workspace code, and verified application behavior as of August 31, 2026. The same workflow supports VCL and FireMonkey applications.</w:t>
       </w:r>
     </w:p>
     <w:p>
       <w:r>
-        <w:t>The guide explains installation, project preparation, every Studio and Setup Wizard screen, every visible operating control, provider security, catalogs, offline packs, component integration, compiler paths, deployment, verification, right-to-left behavior, recovery, and troubleshooting. A developer should be able to start with a GitHub download and finish with a translated Win32 or Win64 application without relying on undocumented steps.</w:t>
+        <w:t>You can read the guide from beginning to end for your first project, or jump directly to the screen or task you need. Along the way, you will learn how to install the Studio, prepare a safe project copy, connect a translation provider, review translations, build language packs, add the runtime components, set Delphi's compiler path, deploy the result, and test both left-to-right and right-to-left languages.</w:t>
       </w:r>
     </w:p>
     <w:p>
       <w:r>
-        <w:t>The product is currently distributed as source. There is no supported binary installer. Use a disposable copy of a target application until the translated result has passed the verification checklist in Chapter 33.</w:t>
+        <w:t>The Studio is currently distributed as source rather than through an installer. That gives you full visibility into what you are building, but it also means the first setup includes a few Delphi steps. They are all explained here. For your first run, work with a disposable copy of your application until it passes the verification checklist in Chapter 33.</w:t>
       </w:r>
     </w:p>
     <w:tbl>
@@ -1660,10 +1660,10 @@
                 <w:b/>
                 <w:color w:val="234C80"/>
               </w:rPr>
-              <w:t xml:space="preserve">Core safety rule. </w:t>
-            </w:r>
-            <w:r>
-              <w:t>Scanning reads the selected Delphi project. Final Setup Wizard processing creates a safety ZIP, workspace files, runtime packs, review artifacts, and a component kit, but the current recommended workflow does not rewrite the target Pascal, DFM, FMX, DPR, or DPROJ files.</w:t>
+              <w:t xml:space="preserve">Your project remains yours. </w:t>
+            </w:r>
+            <w:r>
+              <w:t>Scanning reads the Delphi project you select. Final Setup Wizard processing creates a safety ZIP, workspace files, runtime packs, review artifacts, and a component kit. In the recommended workflow, it does not rewrite your Pascal, DFM, FMX, DPR, or DPROJ files.</w:t>
             </w:r>
           </w:p>
         </w:tc>
@@ -1674,7 +1674,52 @@
         <w:pStyle w:val="Heading2"/>
       </w:pPr>
       <w:r>
-        <w:t>1.1 What the Studio produces</w:t>
+        <w:t>1.1 Choose the path that fits your work</w:t>
+      </w:r>
+    </w:p>
+    <w:p>
+      <w:pPr>
+        <w:pStyle w:val="ListBullet"/>
+      </w:pPr>
+      <w:r>
+        <w:t>First project or first language: begin with Chapter 2 and follow the Setup Wizard chapters in order.</w:t>
+      </w:r>
+    </w:p>
+    <w:p>
+      <w:pPr>
+        <w:pStyle w:val="ListBullet"/>
+      </w:pPr>
+      <w:r>
+        <w:t>Returning to an existing translation: open Maintenance Studio and use Chapters 19-27 as your working reference.</w:t>
+      </w:r>
+    </w:p>
+    <w:p>
+      <w:pPr>
+        <w:pStyle w:val="ListBullet"/>
+      </w:pPr>
+      <w:r>
+        <w:t>Preparing a Delphi project to compile: go directly to Chapters 5 and 6 for components, dependencies, and the compiler Search Path.</w:t>
+      </w:r>
+    </w:p>
+    <w:p>
+      <w:pPr>
+        <w:pStyle w:val="ListBullet"/>
+      </w:pPr>
+      <w:r>
+        <w:t>Something is not working: start with Chapter 32, then use the path and file reference in Chapter 34.</w:t>
+      </w:r>
+    </w:p>
+    <w:p>
+      <w:pPr>
+        <w:pStyle w:val="Heading2"/>
+      </w:pPr>
+      <w:r>
+        <w:t>1.2 What you will have when you finish</w:t>
+      </w:r>
+    </w:p>
+    <w:p>
+      <w:r>
+        <w:t>The Studio keeps development work separate from the files your finished application uses. The following items are created during the workflow; later chapters explain each one in context.</w:t>
       </w:r>
     </w:p>
     <w:tbl>
@@ -1712,7 +1757,7 @@
                 <w:b/>
                 <w:color w:val="FFFFFF"/>
               </w:rPr>
-              <w:t>Product</w:t>
+              <w:t>What is created</w:t>
             </w:r>
           </w:p>
         </w:tc>
@@ -1727,7 +1772,7 @@
                 <w:b/>
                 <w:color w:val="FFFFFF"/>
               </w:rPr>
-              <w:t>Purpose</w:t>
+              <w:t>Why you need it</w:t>
             </w:r>
           </w:p>
         </w:tc>
@@ -1742,7 +1787,7 @@
                 <w:b/>
                 <w:color w:val="FFFFFF"/>
               </w:rPr>
-              <w:t>Primary location</w:t>
+              <w:t>Where to find it</w:t>
             </w:r>
           </w:p>
         </w:tc>
@@ -1981,7 +2026,7 @@
         <w:pStyle w:val="Heading2"/>
       </w:pPr>
       <w:r>
-        <w:t>1.2 Supported and excluded scope</w:t>
+        <w:t>1.3 What this release supports</w:t>
       </w:r>
     </w:p>
     <w:p>
@@ -2037,7 +2082,12 @@
         <w:pStyle w:val="Heading1"/>
       </w:pPr>
       <w:r>
-        <w:t>2. System and Developer Prerequisites</w:t>
+        <w:t>2. Before You Begin</w:t>
+      </w:r>
+    </w:p>
+    <w:p>
+      <w:r>
+        <w:t>A little preparation makes the rest of the process straightforward. Gather the items below before you open the Studio. If your Delphi project does not already build cleanly, fix that first; translation should not be asked to hide an unrelated compiler problem.</w:t>
       </w:r>
     </w:p>
     <w:tbl>
@@ -2074,7 +2124,7 @@
                 <w:b/>
                 <w:color w:val="FFFFFF"/>
               </w:rPr>
-              <w:t>Requirement</w:t>
+              <w:t>You will need</w:t>
             </w:r>
           </w:p>
         </w:tc>
@@ -2089,7 +2139,7 @@
                 <w:b/>
                 <w:color w:val="FFFFFF"/>
               </w:rPr>
-              <w:t>Required state</w:t>
+              <w:t>What to have ready</w:t>
             </w:r>
           </w:p>
         </w:tc>
@@ -2321,10 +2371,10 @@
                 <w:b/>
                 <w:color w:val="234C80"/>
               </w:rPr>
-              <w:t xml:space="preserve">Do not start with the production copy. </w:t>
-            </w:r>
-            <w:r>
-              <w:t>Make a pristine backup and a separate test copy of the Delphi application. Confirm the test copy compiles before adding DAT components or language packs.</w:t>
+              <w:t xml:space="preserve">Start safely. </w:t>
+            </w:r>
+            <w:r>
+              <w:t>Keep a pristine backup and make a separate test copy of the Delphi application. Build that test copy successfully before you add DAT components or language packs. This gives you a clean point of comparison at every stage.</w:t>
             </w:r>
           </w:p>
         </w:tc>
@@ -2335,17 +2385,17 @@
         <w:pStyle w:val="Heading1"/>
       </w:pPr>
       <w:r>
-        <w:t>3. Download the Studio from GitHub</w:t>
+        <w:t>3. Get the Studio from GitHub</w:t>
       </w:r>
     </w:p>
     <w:p>
       <w:r>
-        <w:t>The official repository is https://github.com/tmartindub/DelphiAppTranslationStudio. The entire repository is the required source distribution because the project, packages, runtime units, images, localization files, tests, tools, and documentation use its folder structure.</w:t>
+        <w:t>The official repository is https://github.com/tmartindub/DelphiAppTranslationStudio. Download the whole repository so the Delphi projects, packages, runtime units, images, localization files, tests, tools, and documentation stay together in the folder structure they expect.</w:t>
       </w:r>
     </w:p>
     <w:p>
       <w:r>
-        <w:t>Do not download one .pas file, one .dproj, or a component BPL by itself. A partial download omits package dependencies, runtime units, localization resources, and build output paths.</w:t>
+        <w:t>A single .pas file, .dproj, or component BPL is not enough. Those files rely on neighboring source and package files, and a partial download is the most common way to end up with missing-unit or missing-resource errors.</w:t>
       </w:r>
     </w:p>
     <w:p>
@@ -2365,7 +2415,7 @@
         </w:numPr>
       </w:pPr>
       <w:r>
-        <w:t>Open the repository URL in a browser.</w:t>
+        <w:t>Open the repository URL in your browser.</w:t>
       </w:r>
     </w:p>
     <w:p>
@@ -2401,7 +2451,7 @@
         </w:numPr>
       </w:pPr>
       <w:r>
-        <w:t>Save the ZIP to a normal download folder. Do not run or build from the browser preview or from inside the ZIP.</w:t>
+        <w:t>Save the ZIP to your normal Downloads folder. Extract it before opening anything; Delphi cannot build the project correctly from inside the compressed ZIP.</w:t>
       </w:r>
     </w:p>
     <w:p>
@@ -2425,7 +2475,7 @@
         </w:numPr>
       </w:pPr>
       <w:r>
-        <w:t>Open the extracted root and confirm that DelphiAppTranslationStudio.dproj, source, packages, Localization, docs, tools, and images and icons are present.</w:t>
+        <w:t>Open the extracted root and make sure you can see DelphiAppTranslationStudio.dproj together with the source, packages, Localization, docs, tools, and images and icons folders. If those are present, you have the complete source tree.</w:t>
       </w:r>
     </w:p>
     <w:p>
@@ -2446,7 +2496,7 @@
     </w:p>
     <w:p>
       <w:r>
-        <w:t>Cloning is preferred for developers who will receive updates. Keep local work on a separate branch, review upstream changes, and never commit provider credentials or proprietary target catalogs.</w:t>
+        <w:t>Cloning is the easiest choice if you expect to receive updates. Keep your local work on a separate branch, review incoming changes before merging them, and never commit provider credentials or proprietary application catalogs.</w:t>
       </w:r>
     </w:p>
     <w:p>
@@ -2454,7 +2504,7 @@
         <w:pStyle w:val="Heading2"/>
       </w:pPr>
       <w:r>
-        <w:t>3.3 What not to download</w:t>
+        <w:t>3.3 Avoid these partial-install shortcuts</w:t>
       </w:r>
     </w:p>
     <w:p>
@@ -2486,7 +2536,12 @@
         <w:pStyle w:val="Heading1"/>
       </w:pPr>
       <w:r>
-        <w:t>4. Build and Start the Studio</w:t>
+        <w:t>4. Build and Open the Studio</w:t>
+      </w:r>
+    </w:p>
+    <w:p>
+      <w:r>
+        <w:t>Once the repository is extracted, building the Studio is a normal Delphi project build. Win32 Release is the friendliest first choice because the design-time packages also use Win32.</w:t>
       </w:r>
     </w:p>
     <w:p>
@@ -2534,7 +2589,7 @@
         </w:numPr>
       </w:pPr>
       <w:r>
-        <w:t>Choose Project &gt; Build DelphiAppTranslationStudio.</w:t>
+        <w:t>Choose Project &gt; Build DelphiAppTranslationStudio and wait for a successful build message.</w:t>
       </w:r>
     </w:p>
     <w:p>
@@ -2551,7 +2606,7 @@
     </w:p>
     <w:p>
       <w:r>
-        <w:t>The verified command-line environment is initialized by C:\Program Files (x86)\Embarcadero\Studio\37.0\bin\rsvars.bat. The Win32 compiler is C:\Program Files (x86)\Embarcadero\Studio\37.0\bin\dcc32.exe. These toolchain paths identify Delphi itself; they are different from the target project's DAT unit Search Path described in Chapter 6.</w:t>
+        <w:t>If you prefer a command-line build, initialize Delphi with C:\Program Files (x86)\Embarcadero\Studio\37.0\bin\rsvars.bat. The Win32 compiler is C:\Program Files (x86)\Embarcadero\Studio\37.0\bin\dcc32.exe. These paths point to Delphi itself. They are separate from the DAT unit Search Path you will add to your application in Chapter 6.</w:t>
       </w:r>
     </w:p>
     <w:tbl>
@@ -2591,10 +2646,10 @@
                 <w:b/>
                 <w:color w:val="234C80"/>
               </w:rPr>
-              <w:t xml:space="preserve">Build output. </w:t>
-            </w:r>
-            <w:r>
-              <w:t>Executables go to bin\&lt;Platform&gt;\&lt;Configuration&gt;; DCUs go under dcu. Keep the repository folder structure intact so relative package, localization, export, and documentation paths remain valid.</w:t>
+              <w:t xml:space="preserve">Where did the build go? </w:t>
+            </w:r>
+            <w:r>
+              <w:t>The executable is placed in bin\&lt;Platform&gt;\&lt;Configuration&gt;, and compiled DCUs go under dcu. Keep the repository folder structure intact so packages, localization files, exports, and documentation continue to resolve correctly.</w:t>
             </w:r>
           </w:p>
         </w:tc>
@@ -2605,7 +2660,12 @@
         <w:pStyle w:val="Heading1"/>
       </w:pPr>
       <w:r>
-        <w:t>5. Prepare the Target Delphi Application</w:t>
+        <w:t>5. Prepare Your Delphi Application</w:t>
+      </w:r>
+    </w:p>
+    <w:p>
+      <w:r>
+        <w:t>The Studio calls the application being translated the target application. You only need to prepare it once: install the matching DAT design package, place a language manager and selector on the primary form, and save their properties in the Form Designer.</w:t>
       </w:r>
     </w:p>
     <w:p>
@@ -2617,7 +2677,7 @@
         </w:numPr>
       </w:pPr>
       <w:r>
-        <w:t>Create a pristine backup and a separate test copy of the target application.</w:t>
+        <w:t>Create a pristine backup, then make a separate test copy of the application for localization work.</w:t>
       </w:r>
     </w:p>
     <w:p>
@@ -2677,7 +2737,7 @@
         </w:numPr>
       </w:pPr>
       <w:r>
-        <w:t>Place one TDATVCLLanguageManager or TDATFMXLanguageManager on the primary form.</w:t>
+        <w:t>Place one TDATVCLLanguageManager or TDATFMXLanguageManager on the primary form. It is nonvisual, so it will appear in the designer's component tray.</w:t>
       </w:r>
     </w:p>
     <w:p>
@@ -2713,7 +2773,7 @@
         </w:numPr>
       </w:pPr>
       <w:r>
-        <w:t>Add any supporting Language label or menu captions in the designer, then choose File &gt; Save All.</w:t>
+        <w:t>Add any supporting Language label or menu captions in the designer, then choose File &gt; Save All. Keeping these controls in the designer makes them easy to see and maintain in the Object Inspector.</w:t>
       </w:r>
     </w:p>
     <w:p>
@@ -2765,10 +2825,10 @@
                 <w:b/>
                 <w:color w:val="234C80"/>
               </w:rPr>
-              <w:t xml:space="preserve">One manager. </w:t>
-            </w:r>
-            <w:r>
-              <w:t>The primary form owns the single language manager. Ordinary forms do not need another manager. The manager retranslates open forms and applies the active pack to later forms through the framework-appropriate lifecycle.</w:t>
+              <w:t xml:space="preserve">One manager is enough. </w:t>
+            </w:r>
+            <w:r>
+              <w:t>The primary form owns the application's single language manager. You do not need another manager on every form. The manager retranslates forms that are already open and applies the active language to forms opened later.</w:t>
             </w:r>
           </w:p>
         </w:tc>
@@ -2779,17 +2839,17 @@
         <w:pStyle w:val="Heading1"/>
       </w:pPr>
       <w:r>
-        <w:t>6. The dependencies Folder and Delphi Search Path</w:t>
+        <w:t>6. Give Delphi Access to the DAT Dependencies</w:t>
       </w:r>
     </w:p>
     <w:p>
       <w:r>
-        <w:t>The Studio's generated component kit contains a ComponentSource folder. The Studio does not silently create a dependencies folder inside every target project. A project-local dependencies\DelphiAppTranslation\source folder is an optional, recommended vendoring arrangement when the developer wants the target project to compile independently of the Studio export folder.</w:t>
+        <w:t>The component kit generated by the Studio contains a ComponentSource folder. For a dependable, portable build, copy that complete source set into dependencies\DelphiAppTranslation\source inside your application. The Studio does not create this project-local folder automatically because you, not the Studio, control your application's source tree.</w:t>
       </w:r>
     </w:p>
     <w:p>
       <w:r>
-        <w:t>Create the dependencies folder only in the disposable/controlled target project. Populate it by copying the complete current ComponentSource set generated for that target framework. Do not copy a hand-picked subset: a set that compiles today may fail after another runtime unit begins using a shared dependency.</w:t>
+        <w:t>Copy the complete set rather than choosing individual units. The files are designed and versioned as one dependency set; a partial mixture can compile in one configuration and fail in another when a shared unit is needed.</w:t>
       </w:r>
     </w:p>
     <w:p>
@@ -2797,7 +2857,7 @@
         <w:pStyle w:val="Heading2"/>
       </w:pPr>
       <w:r>
-        <w:t>6.1 Recommended target layout</w:t>
+        <w:t>6.1 The recommended folder layout</w:t>
       </w:r>
     </w:p>
     <w:p>
@@ -2825,7 +2885,7 @@
         </w:numPr>
       </w:pPr>
       <w:r>
-        <w:t>Complete the Wizard or generate a component kit from Maintenance Studio.</w:t>
+        <w:t>Complete the Setup Wizard, or generate a component kit from Maintenance Studio.</w:t>
       </w:r>
     </w:p>
     <w:p>
@@ -2912,9 +2972,8 @@
         </w:tblCellMar>
       </w:tblPr>
       <w:tblGrid>
-        <w:gridCol w:w="1800"/>
-        <w:gridCol w:w="3900"/>
-        <w:gridCol w:w="3660"/>
+        <w:gridCol w:w="2100"/>
+        <w:gridCol w:w="7260"/>
       </w:tblGrid>
       <w:tr>
         <w:trPr>
@@ -2922,7 +2981,7 @@
         </w:trPr>
         <w:tc>
           <w:tcPr>
-            <w:tcW w:type="dxa" w:w="1800"/>
+            <w:tcW w:type="dxa" w:w="2100"/>
             <w:shd w:fill="234C80"/>
           </w:tcPr>
           <w:p>
@@ -2931,13 +2990,13 @@
                 <w:b/>
                 <w:color w:val="FFFFFF"/>
               </w:rPr>
-              <w:t>Shared units</w:t>
-            </w:r>
-          </w:p>
-        </w:tc>
-        <w:tc>
-          <w:tcPr>
-            <w:tcW w:type="dxa" w:w="3900"/>
+              <w:t>Used by</w:t>
+            </w:r>
+          </w:p>
+        </w:tc>
+        <w:tc>
+          <w:tcPr>
+            <w:tcW w:type="dxa" w:w="7260"/>
             <w:shd w:fill="234C80"/>
           </w:tcPr>
           <w:p>
@@ -2946,22 +3005,7 @@
                 <w:b/>
                 <w:color w:val="FFFFFF"/>
               </w:rPr>
-              <w:t>VCL target adds</w:t>
-            </w:r>
-          </w:p>
-        </w:tc>
-        <w:tc>
-          <w:tcPr>
-            <w:tcW w:type="dxa" w:w="3660"/>
-            <w:shd w:fill="234C80"/>
-          </w:tcPr>
-          <w:p>
-            <w:r>
-              <w:rPr>
-                <w:b/>
-                <w:color w:val="FFFFFF"/>
-              </w:rPr>
-              <w:t>FMX target adds</w:t>
+              <w:t>Units to copy</w:t>
             </w:r>
           </w:p>
         </w:tc>
@@ -2972,7 +3016,18 @@
         </w:trPr>
         <w:tc>
           <w:tcPr>
-            <w:tcW w:type="dxa" w:w="1800"/>
+            <w:tcW w:type="dxa" w:w="2100"/>
+            <w:vAlign w:val="center"/>
+          </w:tcPr>
+          <w:p>
+            <w:r>
+              <w:t>Every target</w:t>
+            </w:r>
+          </w:p>
+        </w:tc>
+        <w:tc>
+          <w:tcPr>
+            <w:tcW w:type="dxa" w:w="7260"/>
             <w:vAlign w:val="center"/>
           </w:tcPr>
           <w:p>
@@ -2981,9 +3036,25 @@
             </w:r>
           </w:p>
         </w:tc>
-        <w:tc>
-          <w:tcPr>
-            <w:tcW w:type="dxa" w:w="3900"/>
+      </w:tr>
+      <w:tr>
+        <w:trPr>
+          <w:cantSplit/>
+        </w:trPr>
+        <w:tc>
+          <w:tcPr>
+            <w:tcW w:type="dxa" w:w="2100"/>
+            <w:vAlign w:val="center"/>
+          </w:tcPr>
+          <w:p>
+            <w:r>
+              <w:t>VCL target</w:t>
+            </w:r>
+          </w:p>
+        </w:tc>
+        <w:tc>
+          <w:tcPr>
+            <w:tcW w:type="dxa" w:w="7260"/>
             <w:vAlign w:val="center"/>
           </w:tcPr>
           <w:p>
@@ -2992,9 +3063,25 @@
             </w:r>
           </w:p>
         </w:tc>
-        <w:tc>
-          <w:tcPr>
-            <w:tcW w:type="dxa" w:w="3660"/>
+      </w:tr>
+      <w:tr>
+        <w:trPr>
+          <w:cantSplit/>
+        </w:trPr>
+        <w:tc>
+          <w:tcPr>
+            <w:tcW w:type="dxa" w:w="2100"/>
+            <w:vAlign w:val="center"/>
+          </w:tcPr>
+          <w:p>
+            <w:r>
+              <w:t>FireMonkey target</w:t>
+            </w:r>
+          </w:p>
+        </w:tc>
+        <w:tc>
+          <w:tcPr>
+            <w:tcW w:type="dxa" w:w="7260"/>
             <w:vAlign w:val="center"/>
           </w:tcPr>
           <w:p>
@@ -3010,7 +3097,12 @@
         <w:pStyle w:val="Heading2"/>
       </w:pPr>
       <w:r>
-        <w:t>6.3 Set the exact compiler Search Path</w:t>
+        <w:t>6.3 Tell Delphi where the units are</w:t>
+      </w:r>
+    </w:p>
+    <w:p>
+      <w:r>
+        <w:t>Copying the files is only half of the setup. Delphi also needs the folder on the project's compiler Search Path. Set it for all configurations and platforms so Debug, Release, Win32, and Win64 do not quietly use different unit locations.</w:t>
       </w:r>
     </w:p>
     <w:p>
@@ -3162,10 +3254,10 @@
                 <w:b/>
                 <w:color w:val="234C80"/>
               </w:rPr>
-              <w:t xml:space="preserve">Alternative. </w:t>
-            </w:r>
-            <w:r>
-              <w:t>A project may point directly to export\component-integration\&lt;ApplicationId&gt;\ComponentSource. That works, but the target then depends on a generated Studio export path. The project-local dependency folder is easier to archive, clone, and build on another development system.</w:t>
+              <w:t xml:space="preserve">You can point to the export folder, but... </w:t>
+            </w:r>
+            <w:r>
+              <w:t>A project may use export\component-integration\&lt;ApplicationId&gt;\ComponentSource directly. That works, but it ties the application to a generated Studio location. The project-local dependencies folder is easier to archive, clone, and build on another computer.</w:t>
             </w:r>
           </w:p>
         </w:tc>
@@ -3176,12 +3268,17 @@
         <w:pStyle w:val="Heading1"/>
       </w:pPr>
       <w:r>
-        <w:t>7. Files Stored Under %LOCALAPPDATA%</w:t>
+        <w:t>7. Understand the Files Under %LOCALAPPDATA%</w:t>
       </w:r>
     </w:p>
     <w:p>
       <w:r>
-        <w:t>%LOCALAPPDATA% expands to the current Windows user's Local AppData folder, normally C:\Users\&lt;WindowsUser&gt;\AppData\Local. These files are per-user working state. They are deliberately outside Program Files and outside the target project so normal Windows permissions do not require the executable folder to be writable.</w:t>
+        <w:t>The Studio keeps your working settings and translation workspace under %LOCALAPPDATA%, normally C:\Users\&lt;WindowsUser&gt;\AppData\Local. These are per-user files. Keeping them outside Program Files and outside your application lets the Studio save normal working state without asking Windows for permission to rewrite an installed program folder.</w:t>
+      </w:r>
+    </w:p>
+    <w:p>
+      <w:r>
+        <w:t>Most of the time, you will not need to open these files yourself. They become important when you are moving work to another computer, diagnosing a recovery, checking which catalog is active, or removing a remembered preference.</w:t>
       </w:r>
     </w:p>
     <w:tbl>
@@ -3200,8 +3297,8 @@
         </w:tblCellMar>
       </w:tblPr>
       <w:tblGrid>
-        <w:gridCol w:w="1800"/>
-        <w:gridCol w:w="3900"/>
+        <w:gridCol w:w="3000"/>
+        <w:gridCol w:w="2700"/>
         <w:gridCol w:w="3660"/>
       </w:tblGrid>
       <w:tr>
@@ -3210,7 +3307,7 @@
         </w:trPr>
         <w:tc>
           <w:tcPr>
-            <w:tcW w:type="dxa" w:w="1800"/>
+            <w:tcW w:type="dxa" w:w="3000"/>
             <w:shd w:fill="234C80"/>
           </w:tcPr>
           <w:p>
@@ -3225,7 +3322,7 @@
         </w:tc>
         <w:tc>
           <w:tcPr>
-            <w:tcW w:type="dxa" w:w="3900"/>
+            <w:tcW w:type="dxa" w:w="2700"/>
             <w:shd w:fill="234C80"/>
           </w:tcPr>
           <w:p>
@@ -3260,7 +3357,7 @@
         </w:trPr>
         <w:tc>
           <w:tcPr>
-            <w:tcW w:type="dxa" w:w="1800"/>
+            <w:tcW w:type="dxa" w:w="3000"/>
             <w:vAlign w:val="center"/>
           </w:tcPr>
           <w:p>
@@ -3271,7 +3368,7 @@
         </w:tc>
         <w:tc>
           <w:tcPr>
-            <w:tcW w:type="dxa" w:w="3900"/>
+            <w:tcW w:type="dxa" w:w="2700"/>
             <w:vAlign w:val="center"/>
           </w:tcPr>
           <w:p>
@@ -3298,7 +3395,7 @@
         </w:trPr>
         <w:tc>
           <w:tcPr>
-            <w:tcW w:type="dxa" w:w="1800"/>
+            <w:tcW w:type="dxa" w:w="3000"/>
             <w:vAlign w:val="center"/>
           </w:tcPr>
           <w:p>
@@ -3309,7 +3406,7 @@
         </w:tc>
         <w:tc>
           <w:tcPr>
-            <w:tcW w:type="dxa" w:w="3900"/>
+            <w:tcW w:type="dxa" w:w="2700"/>
             <w:vAlign w:val="center"/>
           </w:tcPr>
           <w:p>
@@ -3336,7 +3433,7 @@
         </w:trPr>
         <w:tc>
           <w:tcPr>
-            <w:tcW w:type="dxa" w:w="1800"/>
+            <w:tcW w:type="dxa" w:w="3000"/>
             <w:vAlign w:val="center"/>
           </w:tcPr>
           <w:p>
@@ -3347,7 +3444,7 @@
         </w:tc>
         <w:tc>
           <w:tcPr>
-            <w:tcW w:type="dxa" w:w="3900"/>
+            <w:tcW w:type="dxa" w:w="2700"/>
             <w:vAlign w:val="center"/>
           </w:tcPr>
           <w:p>
@@ -3374,7 +3471,7 @@
         </w:trPr>
         <w:tc>
           <w:tcPr>
-            <w:tcW w:type="dxa" w:w="1800"/>
+            <w:tcW w:type="dxa" w:w="3000"/>
             <w:vAlign w:val="center"/>
           </w:tcPr>
           <w:p>
@@ -3385,7 +3482,7 @@
         </w:tc>
         <w:tc>
           <w:tcPr>
-            <w:tcW w:type="dxa" w:w="3900"/>
+            <w:tcW w:type="dxa" w:w="2700"/>
             <w:vAlign w:val="center"/>
           </w:tcPr>
           <w:p>
@@ -3412,7 +3509,7 @@
         </w:trPr>
         <w:tc>
           <w:tcPr>
-            <w:tcW w:type="dxa" w:w="1800"/>
+            <w:tcW w:type="dxa" w:w="3000"/>
             <w:vAlign w:val="center"/>
           </w:tcPr>
           <w:p>
@@ -3423,7 +3520,7 @@
         </w:tc>
         <w:tc>
           <w:tcPr>
-            <w:tcW w:type="dxa" w:w="3900"/>
+            <w:tcW w:type="dxa" w:w="2700"/>
             <w:vAlign w:val="center"/>
           </w:tcPr>
           <w:p>
@@ -3450,7 +3547,7 @@
         </w:trPr>
         <w:tc>
           <w:tcPr>
-            <w:tcW w:type="dxa" w:w="1800"/>
+            <w:tcW w:type="dxa" w:w="3000"/>
             <w:vAlign w:val="center"/>
           </w:tcPr>
           <w:p>
@@ -3461,7 +3558,7 @@
         </w:tc>
         <w:tc>
           <w:tcPr>
-            <w:tcW w:type="dxa" w:w="3900"/>
+            <w:tcW w:type="dxa" w:w="2700"/>
             <w:vAlign w:val="center"/>
           </w:tcPr>
           <w:p>
@@ -3488,7 +3585,7 @@
         </w:trPr>
         <w:tc>
           <w:tcPr>
-            <w:tcW w:type="dxa" w:w="1800"/>
+            <w:tcW w:type="dxa" w:w="3000"/>
             <w:vAlign w:val="center"/>
           </w:tcPr>
           <w:p>
@@ -3499,7 +3596,7 @@
         </w:tc>
         <w:tc>
           <w:tcPr>
-            <w:tcW w:type="dxa" w:w="3900"/>
+            <w:tcW w:type="dxa" w:w="2700"/>
             <w:vAlign w:val="center"/>
           </w:tcPr>
           <w:p>
@@ -3526,7 +3623,7 @@
         </w:trPr>
         <w:tc>
           <w:tcPr>
-            <w:tcW w:type="dxa" w:w="1800"/>
+            <w:tcW w:type="dxa" w:w="3000"/>
             <w:vAlign w:val="center"/>
           </w:tcPr>
           <w:p>
@@ -3537,7 +3634,7 @@
         </w:tc>
         <w:tc>
           <w:tcPr>
-            <w:tcW w:type="dxa" w:w="3900"/>
+            <w:tcW w:type="dxa" w:w="2700"/>
             <w:vAlign w:val="center"/>
           </w:tcPr>
           <w:p>
@@ -3564,7 +3661,7 @@
         <w:pStyle w:val="Heading2"/>
       </w:pPr>
       <w:r>
-        <w:t>7.1 Atomic recovery files</w:t>
+        <w:t>7.1 Recovery files you may see</w:t>
       </w:r>
     </w:p>
     <w:p>
@@ -3604,17 +3701,17 @@
         <w:pStyle w:val="Heading2"/>
       </w:pPr>
       <w:r>
-        <w:t>7.2 Where API keys are stored</w:t>
+        <w:t>7.2 Where your API keys are kept</w:t>
       </w:r>
     </w:p>
     <w:p>
       <w:r>
-        <w:t>Remembered keys are Windows Generic Credentials, not JSON files. The target names are DelphiAppTranslationStudio/Providers/DeepL and DelphiAppTranslationStudio/Providers/Google Cloud Translation. An unchecked Remember option keeps the key for the current process only and removes any stored credential for that provider.</w:t>
+        <w:t>When you choose Remember, the key is stored as a Windows Generic Credential, not in a JSON file. The credential names are DelphiAppTranslationStudio/Providers/DeepL and DelphiAppTranslationStudio/Providers/Google Cloud Translation. If Remember is clear, the key stays in memory only for the current Studio session, and saving that choice removes any stored credential for that provider.</w:t>
       </w:r>
     </w:p>
     <w:p>
       <w:r>
-        <w:t>Use Windows Credential Manager to confirm or remove remembered credentials. Never paste a key into source, catalogs, bug reports, screenshots, documentation, logs, deployment scripts, or Git.</w:t>
+        <w:t>You can confirm or remove a saved key in Windows Credential Manager. Treat the key like a password: never paste it into source code, catalogs, bug reports, screenshots, documentation, logs, deployment scripts, or Git.</w:t>
       </w:r>
     </w:p>
     <w:p>
@@ -3622,7 +3719,7 @@
         <w:pStyle w:val="Heading1"/>
       </w:pPr>
       <w:r>
-        <w:t>8. Starting the Studio and Keyboard Operation</w:t>
+        <w:t>8. Meet the Start Screen and Keyboard Controls</w:t>
       </w:r>
     </w:p>
     <w:p>
@@ -3682,7 +3779,7 @@
     </w:p>
     <w:p>
       <w:r>
-        <w:t>The landing screen separates first-time setup from maintenance. Run Setup Wizard is the default action, so Enter starts the guided path. Tab and Shift+Tab move between controls; Space activates a focused button or check box; Alt+Down or F4 opens a focused combo box; arrow keys move through its choices; Enter accepts; Escape closes a list or cancels the current dialog where safe.</w:t>
+        <w:t>The start screen gives you two clear choices: a guided first-time setup or direct maintenance of work that already exists. Run Setup Wizard is the default button, so pressing Enter starts the guided path without reaching for the mouse. Use Tab and Shift+Tab to move between controls, Space to activate a focused button or check box, Alt+Down or F4 to open a combo box, the arrow keys to move through choices, Enter to accept, and Escape to close a list or cancel a dialog when it is safe to do so.</w:t>
       </w:r>
     </w:p>
     <w:tbl>
@@ -3720,7 +3817,7 @@
                 <w:b/>
                 <w:color w:val="FFFFFF"/>
               </w:rPr>
-              <w:t>Control or area</w:t>
+              <w:t>On the screen</w:t>
             </w:r>
           </w:p>
         </w:tc>
@@ -3735,7 +3832,7 @@
                 <w:b/>
                 <w:color w:val="FFFFFF"/>
               </w:rPr>
-              <w:t>What it does</w:t>
+              <w:t>How it helps you</w:t>
             </w:r>
           </w:p>
         </w:tc>
@@ -3750,7 +3847,7 @@
                 <w:b/>
                 <w:color w:val="FFFFFF"/>
               </w:rPr>
-              <w:t>When to use it</w:t>
+              <w:t>When you will use it</w:t>
             </w:r>
           </w:p>
         </w:tc>
@@ -3777,7 +3874,7 @@
           </w:tcPr>
           <w:p>
             <w:r>
-              <w:t>Opens the eight-step guided workflow for a new or updated localization setup.</w:t>
+              <w:t>Walks you through the complete eight-step setup.</w:t>
             </w:r>
           </w:p>
         </w:tc>
@@ -3788,7 +3885,7 @@
           </w:tcPr>
           <w:p>
             <w:r>
-              <w:t>Use for the first language or when you want one controlled scan-to-kit pass.</w:t>
+              <w:t>Choose this for your first language or whenever you want one guided scan-to-kit pass.</w:t>
             </w:r>
           </w:p>
         </w:tc>
@@ -4007,17 +4104,17 @@
         <w:pStyle w:val="Heading1"/>
       </w:pPr>
       <w:r>
-        <w:t>9. Setup Wizard Navigation and Safety</w:t>
+        <w:t>9. Move Through the Setup Wizard with Confidence</w:t>
       </w:r>
     </w:p>
     <w:p>
       <w:r>
-        <w:t>The Setup Wizard has eight steps: Welcome, Delphi Project, Deployment, Languages, Translation Service, Scan Project, Review Authorize, and Process Finish. Completed steps may be revisited from the left rail until final processing begins.</w:t>
+        <w:t>The Setup Wizard divides the job into eight manageable steps: Welcome, Delphi Project, Deployment, Languages, Translation Service, Scan Project, Review Authorize, and Process Finish. Until final processing begins, you can click any completed step in the left rail to review or correct an earlier choice.</w:t>
       </w:r>
     </w:p>
     <w:p>
       <w:r>
-        <w:t>Next is the default button on ordinary pages; Enter therefore advances only when the current page is valid. Back returns to the previous page. Cancel closes before processing. During processing it becomes Stop and requests cancellation at a safe boundary. After successful completion Back and Cancel are hidden, leaving Finish as the clear completion action. If processing stops, Cancel remains available so the developer can close after reading the STOPPED result.</w:t>
+        <w:t>On ordinary pages, Next is the default button, so Enter advances after the current page passes its checks. Back returns to the previous page without throwing away your entries. Cancel closes the Wizard before processing. Once processing starts, Cancel becomes Stop and waits for a safe stopping point rather than interrupting a file write. After a successful finish, Back and Cancel disappear so the only action left is Finish. If processing stops with a problem, Cancel remains available after you read the STOPPED message.</w:t>
       </w:r>
     </w:p>
     <w:tbl>
@@ -4055,7 +4152,7 @@
                 <w:b/>
                 <w:color w:val="FFFFFF"/>
               </w:rPr>
-              <w:t>Control or area</w:t>
+              <w:t>On the screen</w:t>
             </w:r>
           </w:p>
         </w:tc>
@@ -4070,7 +4167,7 @@
                 <w:b/>
                 <w:color w:val="FFFFFF"/>
               </w:rPr>
-              <w:t>What it does</w:t>
+              <w:t>How it helps you</w:t>
             </w:r>
           </w:p>
         </w:tc>
@@ -4085,7 +4182,7 @@
                 <w:b/>
                 <w:color w:val="FFFFFF"/>
               </w:rPr>
-              <w:t>When to use it</w:t>
+              <w:t>When you will use it</w:t>
             </w:r>
           </w:p>
         </w:tc>
@@ -4384,7 +4481,7 @@
     </w:p>
     <w:p>
       <w:r>
-        <w:t>Welcome summarizes the controlled workflow and the safety boundary. It makes no project change. Press Enter or choose Next to continue. Back is disabled because there is no earlier Wizard page; Cancel returns to the Studio.</w:t>
+        <w:t>This first page lets you know what the Wizard will do and, just as importantly, what it will not do. Nothing is changed here. Read the safety note, then press Enter or choose Next. Back is disabled because you are already at the beginning; Cancel returns you to the Studio.</w:t>
       </w:r>
     </w:p>
     <w:p>
@@ -4486,7 +4583,7 @@
                 <w:b/>
                 <w:color w:val="FFFFFF"/>
               </w:rPr>
-              <w:t>Control or area</w:t>
+              <w:t>On the screen</w:t>
             </w:r>
           </w:p>
         </w:tc>
@@ -4501,7 +4598,7 @@
                 <w:b/>
                 <w:color w:val="FFFFFF"/>
               </w:rPr>
-              <w:t>What it does</w:t>
+              <w:t>How it helps you</w:t>
             </w:r>
           </w:p>
         </w:tc>
@@ -4516,7 +4613,7 @@
                 <w:b/>
                 <w:color w:val="FFFFFF"/>
               </w:rPr>
-              <w:t>When to use it</w:t>
+              <w:t>When you will use it</w:t>
             </w:r>
           </w:p>
         </w:tc>
@@ -4543,7 +4640,7 @@
           </w:tcPr>
           <w:p>
             <w:r>
-              <w:t>Displays the selected .dproj or .dpr.</w:t>
+              <w:t>Shows the .dproj or .dpr you selected.</w:t>
             </w:r>
           </w:p>
         </w:tc>
@@ -4554,7 +4651,7 @@
           </w:tcPr>
           <w:p>
             <w:r>
-              <w:t>Treat it as read-only confirmation after Browse.</w:t>
+              <w:t>Use it as a final visual check that you opened the intended test copy.</w:t>
             </w:r>
           </w:p>
         </w:tc>
@@ -4581,7 +4678,7 @@
           </w:tcPr>
           <w:p>
             <w:r>
-              <w:t>Selects the Delphi project.</w:t>
+              <w:t>Opens the file picker for your Delphi project.</w:t>
             </w:r>
           </w:p>
         </w:tc>
@@ -4619,7 +4716,7 @@
           </w:tcPr>
           <w:p>
             <w:r>
-              <w:t>Shows the exact project identity used by catalogs and packs.</w:t>
+              <w:t>Shows the identity shared by catalogs, packs, and the runtime manager.</w:t>
             </w:r>
           </w:p>
         </w:tc>
@@ -4630,7 +4727,7 @@
           </w:tcPr>
           <w:p>
             <w:r>
-              <w:t>It must match the manager component's ApplicationId.</w:t>
+              <w:t>Make sure it matches the manager component's ApplicationId.</w:t>
             </w:r>
           </w:p>
         </w:tc>
@@ -4657,7 +4754,7 @@
           </w:tcPr>
           <w:p>
             <w:r>
-              <w:t>Copies the detected ID.</w:t>
+              <w:t>Copies the detected ID to the Clipboard.</w:t>
             </w:r>
           </w:p>
         </w:tc>
@@ -4668,7 +4765,7 @@
           </w:tcPr>
           <w:p>
             <w:r>
-              <w:t>Use when setting the manager in Delphi's Object Inspector.</w:t>
+              <w:t>Paste it into the manager's ApplicationId property in the Object Inspector.</w:t>
             </w:r>
           </w:p>
         </w:tc>
@@ -4695,7 +4792,7 @@
           </w:tcPr>
           <w:p>
             <w:r>
-              <w:t>Reports framework, targets, form resources, and source units.</w:t>
+              <w:t>Summarizes the framework, Windows targets, form resources, and source units the Studio found.</w:t>
             </w:r>
           </w:p>
         </w:tc>
@@ -4706,7 +4803,7 @@
           </w:tcPr>
           <w:p>
             <w:r>
-              <w:t>Verify VCL/FMX and expected project scale before continuing.</w:t>
+              <w:t>Pause here and confirm VCL or FMX and the expected project size before continuing.</w:t>
             </w:r>
           </w:p>
         </w:tc>
@@ -4733,7 +4830,7 @@
           </w:tcPr>
           <w:p>
             <w:r>
-              <w:t>Automatic recommends create/update based on existing workspace state; explicit choices can create or update.</w:t>
+              <w:t>Lets the Studio recommend a new or update workflow, or lets you choose explicitly.</w:t>
             </w:r>
           </w:p>
         </w:tc>
@@ -4744,7 +4841,7 @@
           </w:tcPr>
           <w:p>
             <w:r>
-              <w:t>Use Update Existing Translation to preserve reviewed/approved entries when a compatible catalog exists.</w:t>
+              <w:t>Choose Update Existing Translation when you want compatible reviewed and approved work to carry forward.</w:t>
             </w:r>
           </w:p>
         </w:tc>
@@ -4787,10 +4884,10 @@
                 <w:b/>
                 <w:color w:val="234C80"/>
               </w:rPr>
-              <w:t xml:space="preserve">Application identity is a contract. </w:t>
-            </w:r>
-            <w:r>
-              <w:t>Catalog applicationId, runtime-pack applicationId, manager ApplicationId, workspace folder, and generated kit identity must agree. Changing the identity creates a different localization workspace.</w:t>
+              <w:t xml:space="preserve">Keep the Application ID consistent. </w:t>
+            </w:r>
+            <w:r>
+              <w:t>The catalog applicationId, runtime-pack applicationId, manager ApplicationId, workspace folder, and generated kit identity must all agree. If you change the ID, the Studio correctly treats it as a different localization workspace.</w:t>
             </w:r>
           </w:p>
         </w:tc>
@@ -4895,7 +4992,7 @@
                 <w:b/>
                 <w:color w:val="FFFFFF"/>
               </w:rPr>
-              <w:t>Control or area</w:t>
+              <w:t>On the screen</w:t>
             </w:r>
           </w:p>
         </w:tc>
@@ -4910,7 +5007,7 @@
                 <w:b/>
                 <w:color w:val="FFFFFF"/>
               </w:rPr>
-              <w:t>What it does</w:t>
+              <w:t>How it helps you</w:t>
             </w:r>
           </w:p>
         </w:tc>
@@ -4925,7 +5022,7 @@
                 <w:b/>
                 <w:color w:val="FFFFFF"/>
               </w:rPr>
-              <w:t>When to use it</w:t>
+              <w:t>When you will use it</w:t>
             </w:r>
           </w:p>
         </w:tc>
@@ -4952,7 +5049,7 @@
           </w:tcPr>
           <w:p>
             <w:r>
-              <w:t>Stores separate installed, portable, network, or USB application folders.</w:t>
+              <w:t>Remembers extra installed, portable, network, or USB application folders.</w:t>
             </w:r>
           </w:p>
         </w:tc>
@@ -4963,7 +5060,7 @@
           </w:tcPr>
           <w:p>
             <w:r>
-              <w:t>Leave empty when normal detected build outputs are sufficient.</w:t>
+              <w:t>Leave it empty if the normal detected build folders are all you need.</w:t>
             </w:r>
           </w:p>
         </w:tc>
@@ -4990,7 +5087,7 @@
           </w:tcPr>
           <w:p>
             <w:r>
-              <w:t>Adds one full application destination.</w:t>
+              <w:t>Adds one optional deployment destination.</w:t>
             </w:r>
           </w:p>
         </w:tc>
@@ -5001,7 +5098,7 @@
           </w:tcPr>
           <w:p>
             <w:r>
-              <w:t>Select the folder containing or intended to contain the deployed executable.</w:t>
+              <w:t>Choose the folder that contains, or will contain, the deployed executable.</w:t>
             </w:r>
           </w:p>
         </w:tc>
@@ -5028,7 +5125,7 @@
           </w:tcPr>
           <w:p>
             <w:r>
-              <w:t>Removes only the selected optional destination.</w:t>
+              <w:t>Removes the selected destination from this list.</w:t>
             </w:r>
           </w:p>
         </w:tc>
@@ -5039,7 +5136,7 @@
           </w:tcPr>
           <w:p>
             <w:r>
-              <w:t>Does not delete the folder or application.</w:t>
+              <w:t>It does not delete the folder or anything inside it.</w:t>
             </w:r>
           </w:p>
         </w:tc>
@@ -5066,7 +5163,7 @@
           </w:tcPr>
           <w:p>
             <w:r>
-              <w:t>Allows the optional build/deploy action to place an executable in listed destinations.</w:t>
+              <w:t>Allows the optional build/deploy step to place an executable in the listed destinations.</w:t>
             </w:r>
           </w:p>
         </w:tc>
@@ -5077,7 +5174,7 @@
           </w:tcPr>
           <w:p>
             <w:r>
-              <w:t>Leave clear when only JSON packs should be deployed.</w:t>
+              <w:t>Leave it clear when you only want the JSON language packs copied.</w:t>
             </w:r>
           </w:p>
         </w:tc>
@@ -5085,7 +5182,7 @@
     </w:tbl>
     <w:p>
       <w:r>
-        <w:t>Final processing always attempts pack deployment to existing detected build outputs. Separate destinations are optional. A removable or network destination that is unavailable is reported; it is not silently treated as a successful deployment.</w:t>
+        <w:t>You can safely leave this page empty for a normal local build. Final processing still looks for existing Delphi output folders and deploys language packs where appropriate. Add a separate destination only when you also need an installed, portable, network, or USB copy. If that location is unavailable, the Studio tells you instead of reporting a false success.</w:t>
       </w:r>
     </w:p>
     <w:p>
@@ -5187,7 +5284,7 @@
                 <w:b/>
                 <w:color w:val="FFFFFF"/>
               </w:rPr>
-              <w:t>Control or area</w:t>
+              <w:t>On the screen</w:t>
             </w:r>
           </w:p>
         </w:tc>
@@ -5202,7 +5299,7 @@
                 <w:b/>
                 <w:color w:val="FFFFFF"/>
               </w:rPr>
-              <w:t>What it does</w:t>
+              <w:t>How it helps you</w:t>
             </w:r>
           </w:p>
         </w:tc>
@@ -5217,7 +5314,7 @@
                 <w:b/>
                 <w:color w:val="FFFFFF"/>
               </w:rPr>
-              <w:t>When to use it</w:t>
+              <w:t>When you will use it</w:t>
             </w:r>
           </w:p>
         </w:tc>
@@ -5244,7 +5341,7 @@
           </w:tcPr>
           <w:p>
             <w:r>
-              <w:t>The language of the saved Delphi UI text.</w:t>
+              <w:t>Identifies the language already saved in your Delphi forms and source.</w:t>
             </w:r>
           </w:p>
         </w:tc>
@@ -5255,7 +5352,7 @@
           </w:tcPr>
           <w:p>
             <w:r>
-              <w:t>Normally English (United States) [en-US]. Do not use the desired output language here.</w:t>
+              <w:t>For most projects this is English (United States) [en-US]. Do not choose the language you want to create here.</w:t>
             </w:r>
           </w:p>
         </w:tc>
@@ -5282,7 +5379,7 @@
           </w:tcPr>
           <w:p>
             <w:r>
-              <w:t>The locale being created or updated.</w:t>
+              <w:t>Selects the locale you are creating or updating.</w:t>
             </w:r>
           </w:p>
         </w:tc>
@@ -5293,7 +5390,7 @@
           </w:tcPr>
           <w:p>
             <w:r>
-              <w:t>Select explicitly; the Studio does not silently assume German or another target.</w:t>
+              <w:t>Choose it explicitly so the catalog receives the correct regional rules.</w:t>
             </w:r>
           </w:p>
         </w:tc>
@@ -5320,7 +5417,7 @@
           </w:tcPr>
           <w:p>
             <w:r>
-              <w:t>The display name shown to users in that language.</w:t>
+              <w:t>Controls the language name your users will see.</w:t>
             </w:r>
           </w:p>
         </w:tc>
@@ -5331,7 +5428,7 @@
           </w:tcPr>
           <w:p>
             <w:r>
-              <w:t>Auto-filled from locale facts and editable when the product requires a preferred name.</w:t>
+              <w:t>The Studio fills it automatically; edit it only when your product prefers different wording.</w:t>
             </w:r>
           </w:p>
         </w:tc>
@@ -5358,7 +5455,7 @@
           </w:tcPr>
           <w:p>
             <w:r>
-              <w:t>Derived from locale facts in the catalog/runtime contract.</w:t>
+              <w:t>Comes from the locale's shared language facts.</w:t>
             </w:r>
           </w:p>
         </w:tc>
@@ -5369,7 +5466,7 @@
           </w:tcPr>
           <w:p>
             <w:r>
-              <w:t>Arabic, Hebrew, Persian, Urdu, Pashto, and other RTL locales follow the common RTL path.</w:t>
+              <w:t>Arabic, Hebrew, Persian, Urdu, Pashto, and other RTL locales automatically use the common right-to-left path.</w:t>
             </w:r>
           </w:p>
         </w:tc>
@@ -5377,7 +5474,7 @@
     </w:tbl>
     <w:p>
       <w:r>
-        <w:t>Selecting the target locale also establishes date, time, decimal, thousands, currency, and direction facts. Existing compatible catalogs restore their saved locale facts without a programmatic combo-box event overwriting them.</w:t>
+        <w:t>A locale is more than a language name. Your selection also establishes date and time formats, decimal and thousands separators, currency facts, and reading direction. When you reopen a compatible catalog, its saved locale facts are restored rather than being overwritten by a default selection.</w:t>
       </w:r>
     </w:p>
     <w:p>
@@ -5479,7 +5576,7 @@
                 <w:b/>
                 <w:color w:val="FFFFFF"/>
               </w:rPr>
-              <w:t>Control or area</w:t>
+              <w:t>On the screen</w:t>
             </w:r>
           </w:p>
         </w:tc>
@@ -5494,7 +5591,7 @@
                 <w:b/>
                 <w:color w:val="FFFFFF"/>
               </w:rPr>
-              <w:t>What it does</w:t>
+              <w:t>How it helps you</w:t>
             </w:r>
           </w:p>
         </w:tc>
@@ -5509,7 +5606,7 @@
                 <w:b/>
                 <w:color w:val="FFFFFF"/>
               </w:rPr>
-              <w:t>When to use it</w:t>
+              <w:t>When you will use it</w:t>
             </w:r>
           </w:p>
         </w:tc>
@@ -5536,7 +5633,7 @@
           </w:tcPr>
           <w:p>
             <w:r>
-              <w:t>Selects DeepL or Google Cloud Translation.</w:t>
+              <w:t>Chooses DeepL or Google Cloud Translation.</w:t>
             </w:r>
           </w:p>
         </w:tc>
@@ -5547,7 +5644,7 @@
           </w:tcPr>
           <w:p>
             <w:r>
-              <w:t>DeepL is the recommended and default provider.</w:t>
+              <w:t>DeepL is selected by default and is the recommended starting point.</w:t>
             </w:r>
           </w:p>
         </w:tc>
@@ -5574,7 +5671,7 @@
           </w:tcPr>
           <w:p>
             <w:r>
-              <w:t>Selects API Free or API Pro endpoint.</w:t>
+              <w:t>Chooses the API Free or API Pro endpoint.</w:t>
             </w:r>
           </w:p>
         </w:tc>
@@ -5585,7 +5682,7 @@
           </w:tcPr>
           <w:p>
             <w:r>
-              <w:t>Must match the DeepL key/account plan; ignored for Google.</w:t>
+              <w:t>Match this to your DeepL account; Google ignores this setting.</w:t>
             </w:r>
           </w:p>
         </w:tc>
@@ -5612,7 +5709,7 @@
           </w:tcPr>
           <w:p>
             <w:r>
-              <w:t>Accepts a new key; it is masked.</w:t>
+              <w:t>Accepts a new provider key and masks it on screen.</w:t>
             </w:r>
           </w:p>
         </w:tc>
@@ -5623,7 +5720,7 @@
           </w:tcPr>
           <w:p>
             <w:r>
-              <w:t>A saved key need not be retyped.</w:t>
+              <w:t>Leave it blank when the Studio reports that a saved key is already available.</w:t>
             </w:r>
           </w:p>
         </w:tc>
@@ -5650,7 +5747,7 @@
           </w:tcPr>
           <w:p>
             <w:r>
-              <w:t>Writes a Windows Generic Credential for the selected provider.</w:t>
+              <w:t>Stores the key in Windows Credential Manager for this provider.</w:t>
             </w:r>
           </w:p>
         </w:tc>
@@ -5661,7 +5758,7 @@
           </w:tcPr>
           <w:p>
             <w:r>
-              <w:t>Clear it for session-only use; clearing also removes that provider's stored key when saved.</w:t>
+              <w:t>Clear it for session-only use. Saving the cleared choice also removes that provider's stored credential.</w:t>
             </w:r>
           </w:p>
         </w:tc>
@@ -5688,7 +5785,7 @@
           </w:tcPr>
           <w:p>
             <w:r>
-              <w:t>Stores the new key or keeps it for the session according to Remember.</w:t>
+              <w:t>Saves the pasted key according to your Remember choice.</w:t>
             </w:r>
           </w:p>
         </w:tc>
@@ -5699,7 +5796,7 @@
           </w:tcPr>
           <w:p>
             <w:r>
-              <w:t>Use after pasting or replacing a key.</w:t>
+              <w:t>Choose it whenever you add or rotate a key.</w:t>
             </w:r>
           </w:p>
         </w:tc>
@@ -5726,7 +5823,7 @@
           </w:tcPr>
           <w:p>
             <w:r>
-              <w:t>Performs a bounded provider request using the selected plan/settings.</w:t>
+              <w:t>Makes a small, time-limited provider request.</w:t>
             </w:r>
           </w:p>
         </w:tc>
@@ -5737,7 +5834,7 @@
           </w:tcPr>
           <w:p>
             <w:r>
-              <w:t>A result or timeout is reported; the UI remains cancellable.</w:t>
+              <w:t>Use it before a long translation run; you will receive either a result or a timeout, and the UI remains responsive.</w:t>
             </w:r>
           </w:p>
         </w:tc>
@@ -5764,7 +5861,7 @@
           </w:tcPr>
           <w:p>
             <w:r>
-              <w:t>States whether a saved key exists and reports test results.</w:t>
+              <w:t>Tells you whether a saved key exists and reports connection results.</w:t>
             </w:r>
           </w:p>
         </w:tc>
@@ -5775,7 +5872,7 @@
           </w:tcPr>
           <w:p>
             <w:r>
-              <w:t>A saved-key message does not reveal the key.</w:t>
+              <w:t>It confirms availability without ever displaying the saved key.</w:t>
             </w:r>
           </w:p>
         </w:tc>
@@ -5818,10 +5915,10 @@
                 <w:b/>
                 <w:color w:val="234C80"/>
               </w:rPr>
-              <w:t xml:space="preserve">Keys are provider-specific. </w:t>
-            </w:r>
-            <w:r>
-              <w:t>Switching provider does not reuse the other provider's key. A DeepL credential can exist at the same time as a Google credential.</w:t>
+              <w:t xml:space="preserve">Each provider keeps its own key. </w:t>
+            </w:r>
+            <w:r>
+              <w:t>Switching providers does not copy or reuse the other provider's credential. You can safely have a DeepL key and a Google key stored at the same time.</w:t>
             </w:r>
           </w:p>
         </w:tc>
@@ -5893,12 +5990,12 @@
     </w:p>
     <w:p>
       <w:r>
-        <w:t>Scan Project reads saved forms and supported source/resource contracts. The current summary distinguishes unique catalog entries from raw observations. Equivalent duplicate occurrences are collapsed; semantic contracts recovered from compatible prior work remain identified; conflicting duplicate keys remain visible for correction.</w:t>
+        <w:t>This is where the Studio discovers the text your users can see. Scan Project reads saved forms and supported source/resource contracts, then reports both unique catalog entries and the raw observations that produced them. Equivalent duplicates are collapsed so you do not translate the same semantic entry repeatedly. Compatible semantic contracts recovered from earlier work remain identified, while conflicting duplicate keys stay visible for correction.</w:t>
       </w:r>
     </w:p>
     <w:p>
       <w:r>
-        <w:t>The list is evidence, not a second catalog editor. Review project/form/source counts and sample entries. If the count is unexpectedly small, confirm that the correct project copy was selected, forms are saved, expected source directories are in the project, and any external JSON prose has an explicit dat-translatable-resources.json manifest.</w:t>
+        <w:t>Treat the list as a confidence check rather than a second catalog editor. Look at the project, form, and source counts, then read a few familiar entries. If the result seems too small, first confirm that you selected the correct project copy and saved every form. Then check that expected source directories belong to the project and that external JSON prose is declared through dat-translatable-resources.json.</w:t>
       </w:r>
     </w:p>
     <w:tbl>
@@ -5936,7 +6033,7 @@
                 <w:b/>
                 <w:color w:val="FFFFFF"/>
               </w:rPr>
-              <w:t>Control or area</w:t>
+              <w:t>On the screen</w:t>
             </w:r>
           </w:p>
         </w:tc>
@@ -5951,7 +6048,7 @@
                 <w:b/>
                 <w:color w:val="FFFFFF"/>
               </w:rPr>
-              <w:t>What it does</w:t>
+              <w:t>How it helps you</w:t>
             </w:r>
           </w:p>
         </w:tc>
@@ -5966,7 +6063,7 @@
                 <w:b/>
                 <w:color w:val="FFFFFF"/>
               </w:rPr>
-              <w:t>When to use it</w:t>
+              <w:t>When you will use it</w:t>
             </w:r>
           </w:p>
         </w:tc>
@@ -5993,7 +6090,7 @@
           </w:tcPr>
           <w:p>
             <w:r>
-              <w:t>Runs or reruns the inventory.</w:t>
+              <w:t>Runs the inventory again.</w:t>
             </w:r>
           </w:p>
         </w:tc>
@@ -6004,7 +6101,7 @@
           </w:tcPr>
           <w:p>
             <w:r>
-              <w:t>Rerun after saving target UI/source changes.</w:t>
+              <w:t>Rerun it after you save changes to forms, UI source, or declared resources.</w:t>
             </w:r>
           </w:p>
         </w:tc>
@@ -6031,7 +6128,7 @@
           </w:tcPr>
           <w:p>
             <w:r>
-              <w:t>Reports unique entries, raw occurrences, recovered semantic contracts, and collapsed duplicates.</w:t>
+              <w:t>Separates unique entries, raw occurrences, recovered semantic contracts, and collapsed duplicates.</w:t>
             </w:r>
           </w:p>
         </w:tc>
@@ -6042,7 +6139,7 @@
           </w:tcPr>
           <w:p>
             <w:r>
-              <w:t>Use these categories when comparing Maintenance and Wizard scans.</w:t>
+              <w:t>Use the same categories when you compare Wizard and Maintenance scans.</w:t>
             </w:r>
           </w:p>
         </w:tc>
@@ -6069,7 +6166,7 @@
           </w:tcPr>
           <w:p>
             <w:r>
-              <w:t>Lists key, source text, and representative observations.</w:t>
+              <w:t>Shows keys, source wording, and representative places where the wording was found.</w:t>
             </w:r>
           </w:p>
         </w:tc>
@@ -6080,7 +6177,7 @@
           </w:tcPr>
           <w:p>
             <w:r>
-              <w:t>Spot-check the first entries and search later in the development catalog for full details.</w:t>
+              <w:t>Spot-check familiar entries here; the development catalog contains the complete record.</w:t>
             </w:r>
           </w:p>
         </w:tc>
@@ -6107,7 +6204,7 @@
           </w:tcPr>
           <w:p>
             <w:r>
-              <w:t>Continues to Review Authorize after a successful scan.</w:t>
+              <w:t>Moves to the final review after a successful scan.</w:t>
             </w:r>
           </w:p>
         </w:tc>
@@ -6118,7 +6215,7 @@
           </w:tcPr>
           <w:p>
             <w:r>
-              <w:t>Automatic translation and Localization Review occur during final processing, not while merely viewing this page.</w:t>
+              <w:t>Translation and Localization Review happen later, during final processing.</w:t>
             </w:r>
           </w:p>
         </w:tc>
@@ -6223,7 +6320,7 @@
                 <w:b/>
                 <w:color w:val="FFFFFF"/>
               </w:rPr>
-              <w:t>Control or area</w:t>
+              <w:t>On the screen</w:t>
             </w:r>
           </w:p>
         </w:tc>
@@ -6238,7 +6335,7 @@
                 <w:b/>
                 <w:color w:val="FFFFFF"/>
               </w:rPr>
-              <w:t>What it does</w:t>
+              <w:t>How it helps you</w:t>
             </w:r>
           </w:p>
         </w:tc>
@@ -6253,7 +6350,7 @@
                 <w:b/>
                 <w:color w:val="FFFFFF"/>
               </w:rPr>
-              <w:t>When to use it</w:t>
+              <w:t>When you will use it</w:t>
             </w:r>
           </w:p>
         </w:tc>
@@ -6280,7 +6377,7 @@
           </w:tcPr>
           <w:p>
             <w:r>
-              <w:t>Summarizes project, application ID, framework, target locale, workflow, provider, scan count, unresolved entries, integration mode, and destinations.</w:t>
+              <w:t>Brings your project, application ID, framework, locale, workflow, provider, counts, integration mode, and destinations together in one place.</w:t>
             </w:r>
           </w:p>
         </w:tc>
@@ -6291,7 +6388,7 @@
           </w:tcPr>
           <w:p>
             <w:r>
-              <w:t>Read it from top to bottom before authorizing.</w:t>
+              <w:t>Read it from top to bottom; it is your chance to catch a wrong project or locale before work begins.</w:t>
             </w:r>
           </w:p>
         </w:tc>
@@ -6318,7 +6415,7 @@
           </w:tcPr>
           <w:p>
             <w:r>
-              <w:t>Confirms the mandatory pre-processing safety archive.</w:t>
+              <w:t>Confirms that the Wizard will create its pre-processing safety archive.</w:t>
             </w:r>
           </w:p>
         </w:tc>
@@ -6329,7 +6426,7 @@
           </w:tcPr>
           <w:p>
             <w:r>
-              <w:t>Required and selected by design.</w:t>
+              <w:t>It is required and selected by design.</w:t>
             </w:r>
           </w:p>
         </w:tc>
@@ -6356,7 +6453,7 @@
           </w:tcPr>
           <w:p>
             <w:r>
-              <w:t>Confirms RAD Studio is not holding the target project during the controlled pass.</w:t>
+              <w:t>Confirms RAD Studio is no longer holding the application open.</w:t>
             </w:r>
           </w:p>
         </w:tc>
@@ -6367,7 +6464,7 @@
           </w:tcPr>
           <w:p>
             <w:r>
-              <w:t>Close the target project, then check it.</w:t>
+              <w:t>Close the target project, then select this confirmation.</w:t>
             </w:r>
           </w:p>
         </w:tc>
@@ -6394,7 +6491,7 @@
           </w:tcPr>
           <w:p>
             <w:r>
-              <w:t>Records the developer's explicit approval.</w:t>
+              <w:t>Records your explicit approval for the controlled processing pass.</w:t>
             </w:r>
           </w:p>
         </w:tc>
@@ -6405,7 +6502,7 @@
           </w:tcPr>
           <w:p>
             <w:r>
-              <w:t>Check only after all earlier choices are correct.</w:t>
+              <w:t>Select it only after the summary is correct.</w:t>
             </w:r>
           </w:p>
         </w:tc>
@@ -6432,7 +6529,7 @@
           </w:tcPr>
           <w:p>
             <w:r>
-              <w:t>Starts backup, translation, review, validation, export, kit generation, builds/deployment where configured, and the completion report.</w:t>
+              <w:t>Starts the backup, translation, review, validation, export, kit generation, configured builds/deployment, and completion report.</w:t>
             </w:r>
           </w:p>
         </w:tc>
@@ -6443,7 +6540,7 @@
           </w:tcPr>
           <w:p>
             <w:r>
-              <w:t>After this click, Back and the rail are disabled; Stop remains available at safe boundaries.</w:t>
+              <w:t>After you choose it, Back and the step rail are disabled; Stop is still honored at safe boundaries.</w:t>
             </w:r>
           </w:p>
         </w:tc>
@@ -6459,7 +6556,7 @@
     </w:p>
     <w:p>
       <w:r>
-        <w:t>Localization Review opens automatically after provider translation and before the final runtime pack is exported. It is part of the same Wizard processing pass. Closing it resumes validation, export, component-kit generation, and deployment.</w:t>
+        <w:t>After machine translation, the Wizard pauses and opens Localization Review so you can look at wording and layout before the runtime pack is finalized. This is where human judgment matters most: short button captions and product terms can be technically translated yet still sound wrong in context. When you close the review window, the same Wizard pass continues with validation, export, component-kit generation, and deployment.</w:t>
       </w:r>
     </w:p>
     <w:tbl>
@@ -6722,10 +6819,10 @@
                 <w:b/>
                 <w:color w:val="234C80"/>
               </w:rPr>
-              <w:t xml:space="preserve">Review is not optional quality theater. </w:t>
-            </w:r>
-            <w:r>
-              <w:t>Provider output may be grammatically valid but wrong for a short UI word. Use source context, project glossary, placeholders, and visual layout before approving terminology.</w:t>
+              <w:t xml:space="preserve">Give short UI text special attention. </w:t>
+            </w:r>
+            <w:r>
+              <w:t>A provider can produce grammatically correct wording that is still wrong for a button, tab, or status label. Check the source context, glossary, placeholders, and visual fit before you approve it.</w:t>
             </w:r>
           </w:p>
         </w:tc>
@@ -6797,12 +6894,12 @@
     </w:p>
     <w:p>
       <w:r>
-        <w:t>The progress memo records the safety backup, catalog work, translation, review return, validation, runtime-pack export, component-kit generation, detected-output deployment, optional destination deployment, and completion report. A failure is prefixed STOPPED and leaves Finish unavailable until the developer has a result to close or retry safely.</w:t>
+        <w:t>The progress memo lets you follow the work without having to interpret a console window. It records the safety backup, catalog work, translation, return from review, validation, runtime-pack export, component-kit generation, detected-output deployment, optional destination deployment, and completion report. If something cannot continue safely, the final diagnostic begins with STOPPED and Finish remains unavailable until you have a result you can close or retry.</w:t>
       </w:r>
     </w:p>
     <w:p>
       <w:r>
-        <w:t>On success the page states that target Pascal, form, DPR, and DPROJ files were not edited. Back and Cancel disappear; choose Finish. The optional deployment card can deploy the application to Step 3 destinations. Leave Rebuild before deploying clear to deploy what final processing just built; select it only when another compile is actually required.</w:t>
+        <w:t>After success, the page confirms that your Pascal, form, DPR, and DPROJ files were not edited. Back and Cancel disappear; choose Finish when you are ready to return to the Studio. The optional deployment card can send the application to the destinations from Step 3. Normally leave Rebuild before deploying clear, because final processing has already built the available target. Select it only when you truly need another compile.</w:t>
       </w:r>
     </w:p>
     <w:tbl>
@@ -6840,7 +6937,7 @@
                 <w:b/>
                 <w:color w:val="FFFFFF"/>
               </w:rPr>
-              <w:t>Control or area</w:t>
+              <w:t>On the screen</w:t>
             </w:r>
           </w:p>
         </w:tc>
@@ -6855,7 +6952,7 @@
                 <w:b/>
                 <w:color w:val="FFFFFF"/>
               </w:rPr>
-              <w:t>What it does</w:t>
+              <w:t>How it helps you</w:t>
             </w:r>
           </w:p>
         </w:tc>
@@ -6870,7 +6967,7 @@
                 <w:b/>
                 <w:color w:val="FFFFFF"/>
               </w:rPr>
-              <w:t>When to use it</w:t>
+              <w:t>When you will use it</w:t>
             </w:r>
           </w:p>
         </w:tc>
@@ -6897,7 +6994,7 @@
           </w:tcPr>
           <w:p>
             <w:r>
-              <w:t>Timestamped operation and diagnostic sequence.</w:t>
+              <w:t>Shows each operation and diagnostic with a time stamp.</w:t>
             </w:r>
           </w:p>
         </w:tc>
@@ -6908,7 +7005,7 @@
           </w:tcPr>
           <w:p>
             <w:r>
-              <w:t>Read the last lines first when processing stops.</w:t>
+              <w:t>If processing stops, begin with the last few lines; they normally contain the cause and next action.</w:t>
             </w:r>
           </w:p>
         </w:tc>
@@ -6935,7 +7032,7 @@
           </w:tcPr>
           <w:p>
             <w:r>
-              <w:t>Copies packs to a manually chosen application folder.</w:t>
+              <w:t>Copies packs to a folder you choose now.</w:t>
             </w:r>
           </w:p>
         </w:tc>
@@ -6946,7 +7043,7 @@
           </w:tcPr>
           <w:p>
             <w:r>
-              <w:t>Use for a one-off destination not saved in Step 3.</w:t>
+              <w:t>Use it for a one-time destination that was not saved in Step 3.</w:t>
             </w:r>
           </w:p>
         </w:tc>
@@ -7087,7 +7184,7 @@
           </w:tcPr>
           <w:p>
             <w:r>
-              <w:t>Closes after successful completion.</w:t>
+              <w:t>Closes the successfully completed Wizard.</w:t>
             </w:r>
           </w:p>
         </w:tc>
@@ -7098,7 +7195,7 @@
           </w:tcPr>
           <w:p>
             <w:r>
-              <w:t>Use even if no optional blue-card deployment was requested.</w:t>
+              <w:t>Choose it even when you did not request the optional blue-card deployment.</w:t>
             </w:r>
           </w:p>
         </w:tc>
@@ -7125,7 +7222,7 @@
           </w:tcPr>
           <w:p>
             <w:r>
-              <w:t>Closes an unsuccessful Wizard after the diagnostic is read.</w:t>
+              <w:t>Closes an unsuccessful Wizard after you have read the diagnostic.</w:t>
             </w:r>
           </w:p>
         </w:tc>
@@ -7136,7 +7233,7 @@
           </w:tcPr>
           <w:p>
             <w:r>
-              <w:t>It is hidden/disabled after success because Finish is the correct action.</w:t>
+              <w:t>It disappears after success because Finish is then the correct action.</w:t>
             </w:r>
           </w:p>
         </w:tc>
@@ -7152,7 +7249,7 @@
     </w:p>
     <w:p>
       <w:r>
-        <w:t>Maintenance Studio is the direct seven-page workflow: Project, Scan, Translate, Validation, Export, Integration, and Provider Settings. The left rail changes pages without rerunning completed work. Status text at the bottom reports the last action and often supplies the next required step.</w:t>
+        <w:t>Maintenance Studio is your workspace after the guided setup. Its seven pages - Project, Scan, Translate, Validation, Export, Integration, and Provider Settings - let you go directly to the part of the translation you want to maintain. Moving through the left rail does not rerun completed work. Keep an eye on the status line at the bottom; it confirms the last action and often tells you exactly what to do next.</w:t>
       </w:r>
     </w:p>
     <w:p>
@@ -7254,7 +7351,7 @@
                 <w:b/>
                 <w:color w:val="FFFFFF"/>
               </w:rPr>
-              <w:t>Control or area</w:t>
+              <w:t>On the screen</w:t>
             </w:r>
           </w:p>
         </w:tc>
@@ -7269,7 +7366,7 @@
                 <w:b/>
                 <w:color w:val="FFFFFF"/>
               </w:rPr>
-              <w:t>What it does</w:t>
+              <w:t>How it helps you</w:t>
             </w:r>
           </w:p>
         </w:tc>
@@ -7284,7 +7381,7 @@
                 <w:b/>
                 <w:color w:val="FFFFFF"/>
               </w:rPr>
-              <w:t>When to use it</w:t>
+              <w:t>When you will use it</w:t>
             </w:r>
           </w:p>
         </w:tc>
@@ -7311,7 +7408,7 @@
           </w:tcPr>
           <w:p>
             <w:r>
-              <w:t>Opens the guided workflow while retaining the current project context where applicable.</w:t>
+              <w:t>Returns you to the guided workflow and keeps current project context where possible.</w:t>
             </w:r>
           </w:p>
         </w:tc>
@@ -7322,7 +7419,7 @@
           </w:tcPr>
           <w:p>
             <w:r>
-              <w:t>Use when maintenance reveals that a complete controlled pass is preferable.</w:t>
+              <w:t>Use it when the maintenance task has grown into a complete scan-to-kit update.</w:t>
             </w:r>
           </w:p>
         </w:tc>
@@ -7349,7 +7446,7 @@
           </w:tcPr>
           <w:p>
             <w:r>
-              <w:t>Selects a .dproj or .dpr and inventories project metadata without editing it.</w:t>
+              <w:t>Selects a .dproj or .dpr and reads its project facts without editing it.</w:t>
             </w:r>
           </w:p>
         </w:tc>
@@ -7360,7 +7457,7 @@
           </w:tcPr>
           <w:p>
             <w:r>
-              <w:t>Use before Scan on a new Maintenance session.</w:t>
+              <w:t>Use it at the beginning of a Maintenance session.</w:t>
             </w:r>
           </w:p>
         </w:tc>
@@ -7387,7 +7484,7 @@
           </w:tcPr>
           <w:p>
             <w:r>
-              <w:t>Shows project name, framework, Windows targets, form-resource count, and source-unit count.</w:t>
+              <w:t>Shows the project name, framework, Windows targets, form count, and source-unit count.</w:t>
             </w:r>
           </w:p>
         </w:tc>
@@ -7398,7 +7495,7 @@
           </w:tcPr>
           <w:p>
             <w:r>
-              <w:t>Verify all values before comparing scan counts.</w:t>
+              <w:t>Confirm these values before you compare scans or open a catalog.</w:t>
             </w:r>
           </w:p>
         </w:tc>
@@ -7425,7 +7522,7 @@
           </w:tcPr>
           <w:p>
             <w:r>
-              <w:t>Runs the same canonical scanner used by the Wizard.</w:t>
+              <w:t>Runs the same scanner used by the Setup Wizard.</w:t>
             </w:r>
           </w:p>
         </w:tc>
@@ -7436,7 +7533,7 @@
           </w:tcPr>
           <w:p>
             <w:r>
-              <w:t>Use after opening or saving changes.</w:t>
+              <w:t>Use it after opening the project or saving UI/source changes.</w:t>
             </w:r>
           </w:p>
         </w:tc>
@@ -7463,7 +7560,7 @@
           </w:tcPr>
           <w:p>
             <w:r>
-              <w:t>Shows unique entries, elapsed time, category breakdown, and observations.</w:t>
+              <w:t>Shows unique entries, elapsed time, category totals, and observations.</w:t>
             </w:r>
           </w:p>
         </w:tc>
@@ -7474,7 +7571,7 @@
           </w:tcPr>
           <w:p>
             <w:r>
-              <w:t>Maintenance and Wizard totals should agree when project, source state, and merge basis agree.</w:t>
+              <w:t>Wizard and Maintenance totals should agree when the project, saved source, and merge basis are the same.</w:t>
             </w:r>
           </w:p>
         </w:tc>
@@ -7546,12 +7643,12 @@
     </w:p>
     <w:p>
       <w:r>
-        <w:t>The canonical scanner is shared by Maintenance and Wizard. A difference is valid only when the opened project, saved source, scanner rules, catalog merge state, or displayed category differs. The current display uses unique catalog entries as the headline and separately reports raw scanned occurrences, recovered semantic contracts, and duplicate occurrences.</w:t>
+        <w:t>Maintenance Studio and the Setup Wizard use the same scanner. When both are looking at the same saved project with the same catalog basis, their totals should agree. The large headline is the number of unique catalog entries; raw occurrences, recovered semantic contracts, and duplicates are shown separately so you can understand where that total came from.</w:t>
       </w:r>
     </w:p>
     <w:p>
       <w:r>
-        <w:t>A scan is read-only with respect to the selected Delphi project. Saving or merging the resulting catalog writes the Studio workspace, not target Pascal or forms.</w:t>
+        <w:t>Scanning does not edit the Delphi project. When you later save or merge the catalog, the Studio writes to its own workspace, not to your Pascal units or forms.</w:t>
       </w:r>
     </w:p>
     <w:p>
@@ -7560,6 +7657,11 @@
       </w:pPr>
       <w:r>
         <w:t>22. Maintenance Page 3 - Translate</w:t>
+      </w:r>
+    </w:p>
+    <w:p>
+      <w:r>
+        <w:t>This is the page you will spend the most time on when refining a language. It combines locale settings, the catalog entry list, source context, translated text, suggestions, review state, approval, CSV exchange, and automatic provider translation. Work one entry at a time when wording is delicate; use bulk actions only after you understand exactly which records they will affect.</w:t>
       </w:r>
     </w:p>
     <w:p>
@@ -7652,7 +7754,7 @@
                 <w:b/>
                 <w:color w:val="FFFFFF"/>
               </w:rPr>
-              <w:t>Control or area</w:t>
+              <w:t>On the screen</w:t>
             </w:r>
           </w:p>
         </w:tc>
@@ -7667,7 +7769,7 @@
                 <w:b/>
                 <w:color w:val="FFFFFF"/>
               </w:rPr>
-              <w:t>What it does</w:t>
+              <w:t>How it helps you</w:t>
             </w:r>
           </w:p>
         </w:tc>
@@ -7682,7 +7784,7 @@
                 <w:b/>
                 <w:color w:val="FFFFFF"/>
               </w:rPr>
-              <w:t>When to use it</w:t>
+              <w:t>When you will use it</w:t>
             </w:r>
           </w:p>
         </w:tc>
@@ -7709,7 +7811,7 @@
           </w:tcPr>
           <w:p>
             <w:r>
-              <w:t>Select catalog locales.</w:t>
+              <w:t>Identifies the catalog's original and translated locales.</w:t>
             </w:r>
           </w:p>
         </w:tc>
@@ -7720,7 +7822,7 @@
           </w:tcPr>
           <w:p>
             <w:r>
-              <w:t>Target selection is required before a new catalog is created.</w:t>
+              <w:t>Choose the target before you create a new catalog.</w:t>
             </w:r>
           </w:p>
         </w:tc>
@@ -7861,7 +7963,7 @@
           </w:tcPr>
           <w:p>
             <w:r>
-              <w:t>Shows key plus translation/review status.</w:t>
+              <w:t>Shows each stable key and its translation/review state.</w:t>
             </w:r>
           </w:p>
         </w:tc>
@@ -7872,7 +7974,7 @@
           </w:tcPr>
           <w:p>
             <w:r>
-              <w:t>Select an entry for context and editing.</w:t>
+              <w:t>Select an entry to see its source context and edit its translation.</w:t>
             </w:r>
           </w:p>
         </w:tc>
@@ -7899,7 +8001,7 @@
           </w:tcPr>
           <w:p>
             <w:r>
-              <w:t>Read-only source wording and context.</w:t>
+              <w:t>Shows the original wording and context without allowing accidental changes.</w:t>
             </w:r>
           </w:p>
         </w:tc>
@@ -7910,7 +8012,7 @@
           </w:tcPr>
           <w:p>
             <w:r>
-              <w:t>Use it to judge ambiguous machine output.</w:t>
+              <w:t>Read it before deciding between two plausible translations.</w:t>
             </w:r>
           </w:p>
         </w:tc>
@@ -7937,7 +8039,7 @@
           </w:tcPr>
           <w:p>
             <w:r>
-              <w:t>Offers translation-memory or terminology suggestions.</w:t>
+              <w:t>Offers wording from translation memory or terminology rules.</w:t>
             </w:r>
           </w:p>
         </w:tc>
@@ -7948,7 +8050,7 @@
           </w:tcPr>
           <w:p>
             <w:r>
-              <w:t>Accept only after checking the exact UI meaning.</w:t>
+              <w:t>Accept it only after checking what this text means on the actual screen.</w:t>
             </w:r>
           </w:p>
         </w:tc>
@@ -8089,7 +8191,7 @@
           </w:tcPr>
           <w:p>
             <w:r>
-              <w:t>Translates unresolved eligible entries through the configured provider.</w:t>
+              <w:t>Sends only unresolved eligible entries to your configured provider.</w:t>
             </w:r>
           </w:p>
         </w:tc>
@@ -8100,7 +8202,7 @@
           </w:tcPr>
           <w:p>
             <w:r>
-              <w:t>Existing unchanged translations are preserved and stable-key/source-text recovery avoids unnecessary retranslating.</w:t>
+              <w:t>Existing unchanged work is preserved, and stable keys plus matching source text recover prior translations whenever possible.</w:t>
             </w:r>
           </w:p>
         </w:tc>
@@ -8116,7 +8218,7 @@
     </w:p>
     <w:p>
       <w:r>
-        <w:t>The Validation page contains Validate the language catalog, an explanation, Run Validation, a summary, and an issue list. Double-clicking an entry-specific issue returns to the corresponding Translate entry.</w:t>
+        <w:t>Validation is the Studio's preflight check. It catches structural problems that would make a runtime pack unsafe or incomplete and separates them from items that need your linguistic judgment. Double-click an entry-specific issue to return directly to that record on the Translate page.</w:t>
       </w:r>
     </w:p>
     <w:tbl>
@@ -8154,7 +8256,7 @@
                 <w:b/>
                 <w:color w:val="FFFFFF"/>
               </w:rPr>
-              <w:t>Control or area</w:t>
+              <w:t>On the screen</w:t>
             </w:r>
           </w:p>
         </w:tc>
@@ -8169,7 +8271,7 @@
                 <w:b/>
                 <w:color w:val="FFFFFF"/>
               </w:rPr>
-              <w:t>What it does</w:t>
+              <w:t>How it helps you</w:t>
             </w:r>
           </w:p>
         </w:tc>
@@ -8184,7 +8286,7 @@
                 <w:b/>
                 <w:color w:val="FFFFFF"/>
               </w:rPr>
-              <w:t>When to use it</w:t>
+              <w:t>When you will use it</w:t>
             </w:r>
           </w:p>
         </w:tc>
@@ -8341,10 +8443,10 @@
                 <w:b/>
                 <w:color w:val="234C80"/>
               </w:rPr>
-              <w:t xml:space="preserve">Structural versus linguistic status. </w:t>
-            </w:r>
-            <w:r>
-              <w:t>Validation can prove that a pack is structurally safe; it cannot prove that a translation is idiomatic or correct for the product. Reviewed and Approved remain separate states.</w:t>
+              <w:t xml:space="preserve">Validation cannot replace a human reader. </w:t>
+            </w:r>
+            <w:r>
+              <w:t>The Studio can prove that a pack is structurally safe, but it cannot decide whether every sentence sounds natural or uses the right product language. Reviewed and Approved therefore remain separate human decisions.</w:t>
             </w:r>
           </w:p>
         </w:tc>
@@ -8360,7 +8462,7 @@
     </w:p>
     <w:p>
       <w:r>
-        <w:t>The Export page contains Build the offline runtime pack, the current validation/readiness summary, a clickable output path, and Export Runtime Pack. The button is disabled until the catalog passes required structural validation.</w:t>
+        <w:t>Export turns the development catalog into the compact JSON pack your application reads at runtime. The page shows current readiness and the exact output location. Export Runtime Pack remains disabled until the catalog passes the required structural checks, so an unsafe pack cannot be published by accident.</w:t>
       </w:r>
     </w:p>
     <w:tbl>
@@ -8398,7 +8500,7 @@
                 <w:b/>
                 <w:color w:val="FFFFFF"/>
               </w:rPr>
-              <w:t>Control or area</w:t>
+              <w:t>On the screen</w:t>
             </w:r>
           </w:p>
         </w:tc>
@@ -8413,7 +8515,7 @@
                 <w:b/>
                 <w:color w:val="FFFFFF"/>
               </w:rPr>
-              <w:t>What it does</w:t>
+              <w:t>How it helps you</w:t>
             </w:r>
           </w:p>
         </w:tc>
@@ -8428,7 +8530,7 @@
                 <w:b/>
                 <w:color w:val="FFFFFF"/>
               </w:rPr>
-              <w:t>When to use it</w:t>
+              <w:t>When you will use it</w:t>
             </w:r>
           </w:p>
         </w:tc>
@@ -8646,7 +8748,7 @@
                 <w:b/>
                 <w:color w:val="FFFFFF"/>
               </w:rPr>
-              <w:t>Control or area</w:t>
+              <w:t>On the screen</w:t>
             </w:r>
           </w:p>
         </w:tc>
@@ -8661,7 +8763,7 @@
                 <w:b/>
                 <w:color w:val="FFFFFF"/>
               </w:rPr>
-              <w:t>What it does</w:t>
+              <w:t>How it helps you</w:t>
             </w:r>
           </w:p>
         </w:tc>
@@ -8676,7 +8778,7 @@
                 <w:b/>
                 <w:color w:val="FFFFFF"/>
               </w:rPr>
-              <w:t>When to use it</w:t>
+              <w:t>When you will use it</w:t>
             </w:r>
           </w:p>
         </w:tc>
@@ -8703,7 +8805,7 @@
           </w:tcPr>
           <w:p>
             <w:r>
-              <w:t>Chooses Component Integration (recommended) or Automatic Source Integration (advanced).</w:t>
+              <w:t>Chooses the normal component kit or the advanced source-integration path.</w:t>
             </w:r>
           </w:p>
         </w:tc>
@@ -8714,7 +8816,7 @@
           </w:tcPr>
           <w:p>
             <w:r>
-              <w:t>Use Component Integration for normal projects.</w:t>
+              <w:t>Use Component Integration unless you have a specific, reviewed reason to modify source automatically.</w:t>
             </w:r>
           </w:p>
         </w:tc>
@@ -8779,7 +8881,7 @@
           </w:tcPr>
           <w:p>
             <w:r>
-              <w:t>Calculates framework, available packs, generated units/files, and intended actions without changing the target.</w:t>
+              <w:t>Previews the framework, packs, generated files, and intended actions without changing your application.</w:t>
             </w:r>
           </w:p>
         </w:tc>
@@ -8790,7 +8892,7 @@
           </w:tcPr>
           <w:p>
             <w:r>
-              <w:t>Always inspect the plan first.</w:t>
+              <w:t>Always read the plan before you generate or authorize anything.</w:t>
             </w:r>
           </w:p>
         </w:tc>
@@ -8855,7 +8957,7 @@
           </w:tcPr>
           <w:p>
             <w:r>
-              <w:t>Publishes the non-mutating component kit under export.</w:t>
+              <w:t>Publishes the safe, non-mutating kit under export.</w:t>
             </w:r>
           </w:p>
         </w:tc>
@@ -8866,7 +8968,7 @@
           </w:tcPr>
           <w:p>
             <w:r>
-              <w:t>Recommended action.</w:t>
+              <w:t>This is the recommended action for normal projects.</w:t>
             </w:r>
           </w:p>
         </w:tc>
@@ -8992,6 +9094,11 @@
       </w:pPr>
       <w:r>
         <w:t>26. Maintenance Page 7 - Provider Settings</w:t>
+      </w:r>
+    </w:p>
+    <w:p>
+      <w:r>
+        <w:t>Use this page when you need to change providers, rotate a key, adjust the timeout, or tune the number of strings sent in one request. Provider settings affect translation performed by the Studio; they are never placed in the application you deploy.</w:t>
       </w:r>
     </w:p>
     <w:p>
@@ -9085,7 +9192,7 @@
                 <w:b/>
                 <w:color w:val="FFFFFF"/>
               </w:rPr>
-              <w:t>Control or area</w:t>
+              <w:t>On the screen</w:t>
             </w:r>
           </w:p>
         </w:tc>
@@ -9100,7 +9207,7 @@
                 <w:b/>
                 <w:color w:val="FFFFFF"/>
               </w:rPr>
-              <w:t>What it does</w:t>
+              <w:t>How it helps you</w:t>
             </w:r>
           </w:p>
         </w:tc>
@@ -9115,7 +9222,7 @@
                 <w:b/>
                 <w:color w:val="FFFFFF"/>
               </w:rPr>
-              <w:t>When to use it</w:t>
+              <w:t>When you will use it</w:t>
             </w:r>
           </w:p>
         </w:tc>
@@ -9218,7 +9325,7 @@
           </w:tcPr>
           <w:p>
             <w:r>
-              <w:t>Maximum bounded provider request time; values below 5 are corrected to 5.</w:t>
+              <w:t>Limits how long one provider request may wait; values below 5 are raised to 5.</w:t>
             </w:r>
           </w:p>
         </w:tc>
@@ -9229,7 +9336,7 @@
           </w:tcPr>
           <w:p>
             <w:r>
-              <w:t>Increase only for a demonstrably slow connection; the default is 30.</w:t>
+              <w:t>Keep the 30-second default unless a known slow connection needs more time.</w:t>
             </w:r>
           </w:p>
         </w:tc>
@@ -9408,7 +9515,7 @@
           </w:tcPr>
           <w:p>
             <w:r>
-              <w:t>Tests the selected provider through the bounded asynchronous operation contract.</w:t>
+              <w:t>Checks the selected provider without freezing the Studio indefinitely.</w:t>
             </w:r>
           </w:p>
         </w:tc>
@@ -9419,7 +9526,7 @@
           </w:tcPr>
           <w:p>
             <w:r>
-              <w:t>A failure reports authentication, quota, endpoint, network, or timeout context.</w:t>
+              <w:t>A failure explains whether to look at authentication, quota, endpoint, network, or timeout settings.</w:t>
             </w:r>
           </w:p>
         </w:tc>
@@ -9469,6 +9576,11 @@
       </w:pPr>
       <w:r>
         <w:t>27. DeepL and Google Setup</w:t>
+      </w:r>
+    </w:p>
+    <w:p>
+      <w:r>
+        <w:t>You only need one provider. DeepL is the recommended default, while Google Cloud Translation is available when it better fits your account, language coverage, or quota. In either case, create a dedicated API key for the Studio rather than reusing a broad key from another application.</w:t>
       </w:r>
     </w:p>
     <w:p>
@@ -9639,6 +9751,11 @@
         <w:t>28. Runtime Integration in VCL and FMX</w:t>
       </w:r>
     </w:p>
+    <w:p>
+      <w:r>
+        <w:t>At runtime, the DAT manager connects the language packs to your application's forms. VCL and FMX use different framework adapters, but you work with them in the same way: one manager on the primary form, one connected selector, and validated packs under Localization\Languages.</w:t>
+      </w:r>
+    </w:p>
     <w:tbl>
       <w:tblPr>
         <w:tblStyle w:val="LightShading-Accent1"/>
@@ -9655,9 +9772,9 @@
         </w:tblCellMar>
       </w:tblPr>
       <w:tblGrid>
-        <w:gridCol w:w="1800"/>
-        <w:gridCol w:w="3900"/>
-        <w:gridCol w:w="3660"/>
+        <w:gridCol w:w="2100"/>
+        <w:gridCol w:w="3630"/>
+        <w:gridCol w:w="3630"/>
       </w:tblGrid>
       <w:tr>
         <w:trPr>
@@ -9665,7 +9782,7 @@
         </w:trPr>
         <w:tc>
           <w:tcPr>
-            <w:tcW w:type="dxa" w:w="1800"/>
+            <w:tcW w:type="dxa" w:w="2100"/>
             <w:shd w:fill="234C80"/>
           </w:tcPr>
           <w:p>
@@ -9680,7 +9797,7 @@
         </w:tc>
         <w:tc>
           <w:tcPr>
-            <w:tcW w:type="dxa" w:w="3900"/>
+            <w:tcW w:type="dxa" w:w="3630"/>
             <w:shd w:fill="234C80"/>
           </w:tcPr>
           <w:p>
@@ -9695,7 +9812,7 @@
         </w:tc>
         <w:tc>
           <w:tcPr>
-            <w:tcW w:type="dxa" w:w="3660"/>
+            <w:tcW w:type="dxa" w:w="3630"/>
             <w:shd w:fill="234C80"/>
           </w:tcPr>
           <w:p>
@@ -9715,7 +9832,7 @@
         </w:trPr>
         <w:tc>
           <w:tcPr>
-            <w:tcW w:type="dxa" w:w="1800"/>
+            <w:tcW w:type="dxa" w:w="2100"/>
             <w:vAlign w:val="center"/>
           </w:tcPr>
           <w:p>
@@ -9726,7 +9843,7 @@
         </w:tc>
         <w:tc>
           <w:tcPr>
-            <w:tcW w:type="dxa" w:w="3900"/>
+            <w:tcW w:type="dxa" w:w="3630"/>
             <w:vAlign w:val="center"/>
           </w:tcPr>
           <w:p>
@@ -9737,7 +9854,7 @@
         </w:tc>
         <w:tc>
           <w:tcPr>
-            <w:tcW w:type="dxa" w:w="3660"/>
+            <w:tcW w:type="dxa" w:w="3630"/>
             <w:vAlign w:val="center"/>
           </w:tcPr>
           <w:p>
@@ -9753,7 +9870,7 @@
         </w:trPr>
         <w:tc>
           <w:tcPr>
-            <w:tcW w:type="dxa" w:w="1800"/>
+            <w:tcW w:type="dxa" w:w="2100"/>
             <w:vAlign w:val="center"/>
           </w:tcPr>
           <w:p>
@@ -9764,7 +9881,7 @@
         </w:tc>
         <w:tc>
           <w:tcPr>
-            <w:tcW w:type="dxa" w:w="3900"/>
+            <w:tcW w:type="dxa" w:w="3630"/>
             <w:vAlign w:val="center"/>
           </w:tcPr>
           <w:p>
@@ -9775,7 +9892,7 @@
         </w:tc>
         <w:tc>
           <w:tcPr>
-            <w:tcW w:type="dxa" w:w="3660"/>
+            <w:tcW w:type="dxa" w:w="3630"/>
             <w:vAlign w:val="center"/>
           </w:tcPr>
           <w:p>
@@ -9791,7 +9908,7 @@
         </w:trPr>
         <w:tc>
           <w:tcPr>
-            <w:tcW w:type="dxa" w:w="1800"/>
+            <w:tcW w:type="dxa" w:w="2100"/>
             <w:vAlign w:val="center"/>
           </w:tcPr>
           <w:p>
@@ -9802,7 +9919,7 @@
         </w:tc>
         <w:tc>
           <w:tcPr>
-            <w:tcW w:type="dxa" w:w="3900"/>
+            <w:tcW w:type="dxa" w:w="3630"/>
             <w:vAlign w:val="center"/>
           </w:tcPr>
           <w:p>
@@ -9813,7 +9930,7 @@
         </w:tc>
         <w:tc>
           <w:tcPr>
-            <w:tcW w:type="dxa" w:w="3660"/>
+            <w:tcW w:type="dxa" w:w="3630"/>
             <w:vAlign w:val="center"/>
           </w:tcPr>
           <w:p>
@@ -9829,7 +9946,7 @@
         </w:trPr>
         <w:tc>
           <w:tcPr>
-            <w:tcW w:type="dxa" w:w="1800"/>
+            <w:tcW w:type="dxa" w:w="2100"/>
             <w:vAlign w:val="center"/>
           </w:tcPr>
           <w:p>
@@ -9840,7 +9957,7 @@
         </w:tc>
         <w:tc>
           <w:tcPr>
-            <w:tcW w:type="dxa" w:w="3900"/>
+            <w:tcW w:type="dxa" w:w="3630"/>
             <w:vAlign w:val="center"/>
           </w:tcPr>
           <w:p>
@@ -9851,7 +9968,7 @@
         </w:tc>
         <w:tc>
           <w:tcPr>
-            <w:tcW w:type="dxa" w:w="3660"/>
+            <w:tcW w:type="dxa" w:w="3630"/>
             <w:vAlign w:val="center"/>
           </w:tcPr>
           <w:p>
@@ -9867,7 +9984,7 @@
         </w:trPr>
         <w:tc>
           <w:tcPr>
-            <w:tcW w:type="dxa" w:w="1800"/>
+            <w:tcW w:type="dxa" w:w="2100"/>
             <w:vAlign w:val="center"/>
           </w:tcPr>
           <w:p>
@@ -9878,7 +9995,7 @@
         </w:tc>
         <w:tc>
           <w:tcPr>
-            <w:tcW w:type="dxa" w:w="3900"/>
+            <w:tcW w:type="dxa" w:w="3630"/>
             <w:vAlign w:val="center"/>
           </w:tcPr>
           <w:p>
@@ -9889,7 +10006,7 @@
         </w:tc>
         <w:tc>
           <w:tcPr>
-            <w:tcW w:type="dxa" w:w="3660"/>
+            <w:tcW w:type="dxa" w:w="3630"/>
             <w:vAlign w:val="center"/>
           </w:tcPr>
           <w:p>
@@ -9902,12 +10019,12 @@
     </w:tbl>
     <w:p>
       <w:r>
-        <w:t>The manager discovers validated packs in Localization\Languages, checks application ID/framework/version/locale/checksum/source-pack compatibility, loads the saved preference, and falls back to the validated source language when a stale preference cannot be admitted.</w:t>
+        <w:t>When the application starts, the manager discovers validated packs in Localization\Languages. It checks the application ID, framework, version, locale, checksum, and source-pack compatibility before admitting a pack. It then loads the user's saved preference. If that preference is stale or invalid, the manager safely returns to the validated source language.</w:t>
       </w:r>
     </w:p>
     <w:p>
       <w:r>
-        <w:t>Selecting a language retranslates open forms immediately and persists the locale. English is a generated source pack, so switching back restores scanned English text without restarting. Writable control state, focus, selections, list selection, and live data are preserved by the runtime contract.</w:t>
+        <w:t>Choosing another language retranslates open forms immediately and remembers the selection. English is generated as a real source pack, so switching back restores the scanned English text without restarting. The runtime is designed to preserve writable control contents, focus, selections, list state, and live data while visible language text changes.</w:t>
       </w:r>
     </w:p>
     <w:p>
@@ -9916,6 +10033,11 @@
       </w:pPr>
       <w:r>
         <w:t>29. Build, Deploy, and Verify</w:t>
+      </w:r>
+    </w:p>
+    <w:p>
+      <w:r>
+        <w:t>A successful build is not the end of localization; it is the beginning of visual verification. Follow this sequence so you always know which executable, dependency set, and pack folder you are testing.</w:t>
       </w:r>
     </w:p>
     <w:p>
@@ -9999,7 +10121,7 @@
         </w:numPr>
       </w:pPr>
       <w:r>
-        <w:t>Run from the actual output folder, not an older copy elsewhere.</w:t>
+        <w:t>Run the executable from the actual output folder. If Windows has another copy elsewhere, close it so you do not accidentally test stale code or stale packs.</w:t>
       </w:r>
     </w:p>
     <w:p>
@@ -10044,6 +10166,11 @@
       </w:pPr>
       <w:r>
         <w:t>30. RTL, Layout, HTML, and Dynamic Text</w:t>
+      </w:r>
+    </w:p>
+    <w:p>
+      <w:r>
+        <w:t>Translation changes more than words. A longer label may need space, Arabic or Hebrew changes reading direction, and generated HTML must preserve its markup while translating visible prose. The shared DAT contracts handle these concerns consistently, but every shipped screen still deserves a visual review.</w:t>
       </w:r>
     </w:p>
     <w:p>
@@ -10111,6 +10238,11 @@
       </w:r>
     </w:p>
     <w:p>
+      <w:r>
+        <w:t>The Studio is designed so the online provider is part of development, not part of your deployed application. Keep the following habits in place and you can translate without putting credentials or customer information into the deliverable.</w:t>
+      </w:r>
+    </w:p>
+    <w:p>
       <w:pPr>
         <w:pStyle w:val="ListBullet"/>
       </w:pPr>
@@ -10166,6 +10298,11 @@
         <w:t>32. Troubleshooting</w:t>
       </w:r>
     </w:p>
+    <w:p>
+      <w:r>
+        <w:t>When something looks wrong, resist the urge to make several changes at once. Start with the symptom below, check the most likely cause, make one correction, and rebuild or rerun the affected step. That keeps a small configuration issue from turning into a hard-to-explain project change.</w:t>
+      </w:r>
+    </w:p>
     <w:tbl>
       <w:tblPr>
         <w:tblStyle w:val="LightShading-Accent1"/>
@@ -10201,7 +10338,7 @@
                 <w:b/>
                 <w:color w:val="FFFFFF"/>
               </w:rPr>
-              <w:t>Symptom</w:t>
+              <w:t>What you see</w:t>
             </w:r>
           </w:p>
         </w:tc>
@@ -10216,7 +10353,7 @@
                 <w:b/>
                 <w:color w:val="FFFFFF"/>
               </w:rPr>
-              <w:t>Cause to check</w:t>
+              <w:t>What to check first</w:t>
             </w:r>
           </w:p>
         </w:tc>
@@ -10231,7 +10368,7 @@
                 <w:b/>
                 <w:color w:val="FFFFFF"/>
               </w:rPr>
-              <w:t>Corrective action</w:t>
+              <w:t>What to do next</w:t>
             </w:r>
           </w:p>
         </w:tc>
@@ -10737,6 +10874,11 @@
       </w:pPr>
       <w:r>
         <w:t>33. Complete First-Time Checklist</w:t>
+      </w:r>
+    </w:p>
+    <w:p>
+      <w:r>
+        <w:t>Use this checklist before you call the first localized build complete. It is deliberately thorough; checking each item once is faster than trying to reconstruct a missing setup step later.</w:t>
       </w:r>
     </w:p>
     <w:p>
@@ -10886,6 +11028,11 @@
       </w:pPr>
       <w:r>
         <w:t>34. Quick Path Reference</w:t>
+      </w:r>
+    </w:p>
+    <w:p>
+      <w:r>
+        <w:t>These are the paths you are most likely to need while building, troubleshooting, or moving the project to another computer.</w:t>
       </w:r>
     </w:p>
     <w:tbl>

</xml_diff>